<commit_message>
Changes to be committed: 	modified:   MPP_MES_USER_JOURNEYS.docx 	modified:   MPP_MES_USER_JOURNEYS.md 	modified:   mockup/plantFloor.css 	modified:   mockup/plantFloor.html 	new file:   mockup_screenshots/Screenshot 2026-05-04 105438.png
</commit_message>
<xml_diff>
--- a/MPP_MES_USER_JOURNEYS.docx
+++ b/MPP_MES_USER_JOURNEYS.docx
@@ -881,13 +881,25 @@
                 <w:b/>
                 <w:bCs/>
               </w:rPr>
-              <w:t xml:space="preserve">Operator access model clarification + die cast screenshot fix.</w:t>
-            </w:r>
-            <w:r>
-              <w:t xml:space="preserve"> </w:t>
-            </w:r>
-            <w:r>
-              <w:t xml:space="preserve">Added Arc 2 access model statement: operator terminals show only their machine workflow screen; Plant Floor Home, LOT Search, LOT Detail, and Genealogy Lookup are supervisor / elevated views. Die Cast scene: removed the Plant Floor Home — Location Details screenshot (supervisor view, not what Carlos sees); moved the Die Cast LOT Entry screenshot immediately after the initials-entry screen. Trim error state caption updated —</w:t>
+              <w:t xml:space="preserve">Operator access model clarification + die cast shared-terminal fix.</w:t>
+            </w:r>
+            <w:r>
+              <w:t xml:space="preserve"> </w:t>
+            </w:r>
+            <w:r>
+              <w:t xml:space="preserve">Added Arc 2 access model statement: operator terminals show only their machine workflow screen; Plant Floor Home, LOT Search, LOT Detail, and Genealogy Lookup are supervisor / elevated views. Die Cast scene fully rewritten for shared terminal model: removed the Plant Floor Home — Location Details screenshot (supervisor view); removed the dedicated-terminal Operator Presence screenshot (not applicable on a shared terminal); cell selection step (Cell Context Selection modal) now leads the scene — operator must scan or pick their Cell before any workflow screen loads; Die Cast LOT Entry screenshot follows with inline initials; narrative</w:t>
+            </w:r>
+            <w:r>
+              <w:t xml:space="preserve"> </w:t>
+            </w:r>
+            <w:r>
+              <w:t xml:space="preserve">“auto-resolved to Machine #7 from terminal context”</w:t>
+            </w:r>
+            <w:r>
+              <w:t xml:space="preserve"> </w:t>
+            </w:r>
+            <w:r>
+              <w:t xml:space="preserve">corrected to explicit cell selection. Trim error state caption updated —</w:t>
             </w:r>
             <w:r>
               <w:t xml:space="preserve"> </w:t>
@@ -899,7 +911,7 @@
               <w:t xml:space="preserve"> </w:t>
             </w:r>
             <w:r>
-              <w:t xml:space="preserve">removed as an operator action (LOT Detail is elevated access). LOT Detail caption flagged as elevated.</w:t>
+              <w:t xml:space="preserve">removed as an operator action. LOT Detail caption flagged as elevated.</w:t>
             </w:r>
           </w:p>
         </w:tc>
@@ -4536,7 +4548,15 @@
         <w:pStyle w:val="BodyText"/>
       </w:pPr>
       <w:r>
-        <w:t xml:space="preserve">Carlos doesn’t rush to the terminal at every shot. He lets the baskets fill while he walks other machines. Some time later the cavity-A basket is full. He peels a pre-printed LTT barcode label off his stack (MPP pre-prints these in batches per FRS 2.2.1) and sticks it on the cavity-A basket. He walks to the Ignition terminal — dedicated to Machine #7, his initials</w:t>
+        <w:t xml:space="preserve">Carlos doesn’t rush to the terminal at every shot. He lets the baskets fill while he walks other machines. Some time later the cavity-A basket is full. He peels a pre-printed LTT barcode label off his stack (MPP pre-prints these in batches per FRS 2.2.1) and sticks it on the cavity-A basket. He walks to the shared Ignition terminal in the die cast area.</w:t>
+      </w:r>
+    </w:p>
+    <w:p>
+      <w:pPr>
+        <w:pStyle w:val="BodyText"/>
+      </w:pPr>
+      <w:r>
+        <w:t xml:space="preserve">Die cast machines share a floor terminal rather than each having a dedicated one. Before logging anything, Carlos must tell the terminal which machine he’s at. He scans the barcode on Machine #7’s column (or picks from the dropdown) to set his</w:t>
       </w:r>
       <w:r>
         <w:t xml:space="preserve"> </w:t>
@@ -4546,13 +4566,13 @@
           <w:b/>
           <w:bCs/>
         </w:rPr>
-        <w:t xml:space="preserve">CM</w:t>
-      </w:r>
-      <w:r>
-        <w:t xml:space="preserve"> </w:t>
-      </w:r>
-      <w:r>
-        <w:t xml:space="preserve">already set as the active operator presence.</w:t>
+        <w:t xml:space="preserve">Active Cell</w:t>
+      </w:r>
+      <w:r>
+        <w:t xml:space="preserve"> </w:t>
+      </w:r>
+      <w:r>
+        <w:t xml:space="preserve">context.</w:t>
       </w:r>
     </w:p>
     <w:p>
@@ -4562,14 +4582,14 @@
       <w:r>
         <w:drawing>
           <wp:inline>
-            <wp:extent cx="4812631" cy="2993456"/>
+            <wp:extent cx="5334000" cy="3657365"/>
             <wp:effectExtent b="0" l="0" r="0" t="0"/>
-            <wp:docPr descr="Operator Presence — Dedicated Terminal initials entry" title="" id="88" name="Picture"/>
+            <wp:docPr descr="Cell Context Selection — shared terminal, die cast area" title="" id="88" name="Picture"/>
             <a:graphic>
               <a:graphicData uri="http://schemas.openxmlformats.org/drawingml/2006/picture">
                 <pic:pic>
                   <pic:nvPicPr>
-                    <pic:cNvPr descr="mockup_screenshots/Screenshot%202026-04-30%20123815.png" id="89" name="Picture"/>
+                    <pic:cNvPr descr="mockup_screenshots/Screenshot%202026-04-30%20123743.png" id="89" name="Picture"/>
                     <pic:cNvPicPr>
                       <a:picLocks noChangeArrowheads="1" noChangeAspect="1"/>
                     </pic:cNvPicPr>
@@ -4583,7 +4603,7 @@
                   <pic:spPr bwMode="auto">
                     <a:xfrm>
                       <a:off x="0" y="0"/>
-                      <a:ext cx="4812631" cy="2993456"/>
+                      <a:ext cx="5334000" cy="3657365"/>
                     </a:xfrm>
                     <a:prstGeom prst="rect">
                       <a:avLst/>
@@ -4607,7 +4627,7 @@
         <w:pStyle w:val="ImageCaption"/>
       </w:pPr>
       <w:r>
-        <w:t xml:space="preserve">Operator Presence — Dedicated Terminal initials entry</w:t>
+        <w:t xml:space="preserve">Cell Context Selection — shared terminal, die cast area</w:t>
       </w:r>
     </w:p>
     <w:p>
@@ -4619,13 +4639,28 @@
           <w:i/>
           <w:iCs/>
         </w:rPr>
-        <w:t xml:space="preserve">Operator Presence screen on a dedicated terminal: single Initials field with a Set Presence button. No password, no PIN — initials map to AppUser_GetByInitials. Presence persists through the shift subject to a 30-minute idle re-confirm.</w:t>
-      </w:r>
-      <w:r>
-        <w:t xml:space="preserve"> </w:t>
-      </w:r>
-      <w:r>
-        <w:t xml:space="preserve">He scans the LTT barcode.</w:t>
+        <w:t xml:space="preserve">Cell Context Selection: on a shared terminal the operator must select their active Cell before any workflow screen loads — by scanning a Cell barcode or picking from the dropdown of the terminal’s parent Location’s descendant Cells. The selected Cell persists through the session; a Change button at the top of every workflow screen allows mid-shift re-selection if they move to a different machine. All downstream context (Tool, Cavity dropdown, FIFO queue) resolves from this selection.</w:t>
+      </w:r>
+    </w:p>
+    <w:p>
+      <w:pPr>
+        <w:pStyle w:val="BodyText"/>
+      </w:pPr>
+      <w:r>
+        <w:t xml:space="preserve">The terminal’s context snaps to</w:t>
+      </w:r>
+      <w:r>
+        <w:t xml:space="preserve"> </w:t>
+      </w:r>
+      <w:r>
+        <w:rPr>
+          <w:b/>
+          <w:bCs/>
+        </w:rPr>
+        <w:t xml:space="preserve">Press 7</w:t>
+      </w:r>
+      <w:r>
+        <w:t xml:space="preserve">. Carlos scans the LTT barcode he just stuck on the cavity-A basket. The Die Cast LOT Entry form opens.</w:t>
       </w:r>
     </w:p>
     <w:p>
@@ -4692,7 +4727,7 @@
           <w:i/>
           <w:iCs/>
         </w:rPr>
-        <w:t xml:space="preserve">Die Cast LOT Entry screen: Active Cell shown at top with a Change button. LTT Barcode field (scanned — mints a new LOT on first scan), Operator Initials (inline on a shared terminal), Item (auto-resolved from the mounted Tool), Tool (auto-populated from ToolAssignment_ListActiveByCell with an Edit button for elevated reassignment), Cavity dropdown (filtered to active cavities on the mounted die), Piece Count (≤ PartsPerBasket), and optional Weight. Right panel shows Cavity A cumulative ShotCount and ScrapCount plus a Reject Entry panel.</w:t>
+        <w:t xml:space="preserve">Die Cast LOT Entry screen: Active Cell (Press 7) shown at top with a Change button. LTT Barcode field (scanned — mints a new LOT on first scan), Operator Initials (entered inline — shared terminals have no persistent presence screen), Item (auto-resolved from the mounted Tool), Tool (auto-populated from ToolAssignment_ListActiveByCell with an Edit button for elevated reassignment), Cavity dropdown (filtered to active cavities on the mounted die), Piece Count (≤ PartsPerBasket), and optional Weight. Right panel shows Cavity A cumulative ShotCount and ScrapCount plus a Reject Entry panel.</w:t>
       </w:r>
     </w:p>
     <w:p>
@@ -4700,7 +4735,7 @@
         <w:pStyle w:val="BodyText"/>
       </w:pPr>
       <w:r>
-        <w:t xml:space="preserve">The MES opens the LOT creation screen. The</w:t>
+        <w:t xml:space="preserve">The</w:t>
       </w:r>
       <w:r>
         <w:t xml:space="preserve"> </w:t>
@@ -4710,13 +4745,13 @@
           <w:b/>
           <w:bCs/>
         </w:rPr>
-        <w:t xml:space="preserve">Cell</w:t>
-      </w:r>
-      <w:r>
-        <w:t xml:space="preserve"> </w:t>
-      </w:r>
-      <w:r>
-        <w:t xml:space="preserve">is auto-resolved to Machine #7 from the terminal’s machine context. The</w:t>
+        <w:t xml:space="preserve">Tool</w:t>
+      </w:r>
+      <w:r>
+        <w:t xml:space="preserve"> </w:t>
+      </w:r>
+      <w:r>
+        <w:t xml:space="preserve">field pre-populates with</w:t>
       </w:r>
       <w:r>
         <w:t xml:space="preserve"> </w:t>
@@ -4726,13 +4761,28 @@
           <w:b/>
           <w:bCs/>
         </w:rPr>
-        <w:t xml:space="preserve">Tool</w:t>
-      </w:r>
-      <w:r>
-        <w:t xml:space="preserve"> </w:t>
-      </w:r>
-      <w:r>
-        <w:t xml:space="preserve">field pre-populates with</w:t>
+        <w:t xml:space="preserve">DC-042</w:t>
+      </w:r>
+      <w:r>
+        <w:t xml:space="preserve"> </w:t>
+      </w:r>
+      <w:r>
+        <w:t xml:space="preserve">— resolved via</w:t>
+      </w:r>
+      <w:r>
+        <w:t xml:space="preserve"> </w:t>
+      </w:r>
+      <w:r>
+        <w:rPr>
+          <w:rStyle w:val="VerbatimChar"/>
+        </w:rPr>
+        <w:t xml:space="preserve">Tools.ToolAssignment_ListActiveByCell(@CellLocationId)</w:t>
+      </w:r>
+      <w:r>
+        <w:t xml:space="preserve"> </w:t>
+      </w:r>
+      <w:r>
+        <w:t xml:space="preserve">from the active mount on Press 7. Carlos enters his initials</w:t>
       </w:r>
       <w:r>
         <w:t xml:space="preserve"> </w:t>
@@ -4742,28 +4792,10 @@
           <w:b/>
           <w:bCs/>
         </w:rPr>
-        <w:t xml:space="preserve">DC-042</w:t>
-      </w:r>
-      <w:r>
-        <w:t xml:space="preserve"> </w:t>
-      </w:r>
-      <w:r>
-        <w:t xml:space="preserve">— this came from</w:t>
-      </w:r>
-      <w:r>
-        <w:t xml:space="preserve"> </w:t>
-      </w:r>
-      <w:r>
-        <w:rPr>
-          <w:rStyle w:val="VerbatimChar"/>
-        </w:rPr>
-        <w:t xml:space="preserve">Tools.ToolAssignment_ListActiveByCell(@CellLocationId)</w:t>
-      </w:r>
-      <w:r>
-        <w:t xml:space="preserve"> </w:t>
-      </w:r>
-      <w:r>
-        <w:t xml:space="preserve">which looked up the currently-mounted tool on Machine #7. Carlos glances at the die, confirms the system is right, and proceeds. (If the physical die had been swapped without anyone updating the MES, Carlos would hit the</w:t>
+        <w:t xml:space="preserve">CM</w:t>
+      </w:r>
+      <w:r>
+        <w:t xml:space="preserve">, glances at the die, confirms the system is right, and proceeds. (If the physical die had been swapped without anyone updating the MES, Carlos would hit the</w:t>
       </w:r>
       <w:r>
         <w:t xml:space="preserve"> </w:t>
@@ -4862,19 +4894,325 @@
     </w:p>
     <w:p>
       <w:pPr>
+        <w:pStyle w:val="BodyText"/>
+      </w:pPr>
+      <w:r>
+        <w:t xml:space="preserve">A LOT is created —</w:t>
+      </w:r>
+      <w:r>
+        <w:t xml:space="preserve"> </w:t>
+      </w:r>
+      <w:r>
+        <w:rPr>
+          <w:rStyle w:val="VerbatimChar"/>
+        </w:rPr>
+        <w:t xml:space="preserve">LotName</w:t>
+      </w:r>
+      <w:r>
+        <w:t xml:space="preserve"> </w:t>
+      </w:r>
+      <w:r>
+        <w:t xml:space="preserve">minted via</w:t>
+      </w:r>
+      <w:r>
+        <w:t xml:space="preserve"> </w:t>
+      </w:r>
+      <w:r>
+        <w:rPr>
+          <w:rStyle w:val="VerbatimChar"/>
+        </w:rPr>
+        <w:t xml:space="preserve">Lots.IdentifierSequence_Next @Code='Lot'</w:t>
+      </w:r>
+      <w:r>
+        <w:t xml:space="preserve"> </w:t>
+      </w:r>
+      <w:r>
+        <w:t xml:space="preserve">which returns</w:t>
+      </w:r>
+      <w:r>
+        <w:t xml:space="preserve"> </w:t>
+      </w:r>
+      <w:r>
+        <w:rPr>
+          <w:rStyle w:val="VerbatimChar"/>
+        </w:rPr>
+        <w:t xml:space="preserve">MESL1710935</w:t>
+      </w:r>
+      <w:r>
+        <w:t xml:space="preserve"> </w:t>
+      </w:r>
+      <w:r>
+        <w:t xml:space="preserve">(the counter continues from the Flexware cutover seed).</w:t>
+      </w:r>
+      <w:r>
+        <w:t xml:space="preserve"> </w:t>
+      </w:r>
+      <w:r>
+        <w:rPr>
+          <w:rStyle w:val="VerbatimChar"/>
+        </w:rPr>
+        <w:t xml:space="preserve">ToolId</w:t>
+      </w:r>
+      <w:r>
+        <w:t xml:space="preserve"> </w:t>
+      </w:r>
+      <w:r>
+        <w:t xml:space="preserve">points at DC-042.</w:t>
+      </w:r>
+      <w:r>
+        <w:t xml:space="preserve"> </w:t>
+      </w:r>
+      <w:r>
+        <w:rPr>
+          <w:rStyle w:val="VerbatimChar"/>
+        </w:rPr>
+        <w:t xml:space="preserve">ToolCavityId</w:t>
+      </w:r>
+      <w:r>
+        <w:t xml:space="preserve"> </w:t>
+      </w:r>
+      <w:r>
+        <w:t xml:space="preserve">points at Cavity A. Origin: Manufactured. Status: Good. Location: Machine #7. A first</w:t>
+      </w:r>
+      <w:r>
+        <w:t xml:space="preserve"> </w:t>
+      </w:r>
+      <w:r>
+        <w:rPr>
+          <w:rStyle w:val="VerbatimChar"/>
+        </w:rPr>
+        <w:t xml:space="preserve">Workorder.ProductionEvent</w:t>
+      </w:r>
+      <w:r>
+        <w:t xml:space="preserve"> </w:t>
+      </w:r>
+      <w:r>
+        <w:t xml:space="preserve">checkpoint row is written with cumulative</w:t>
+      </w:r>
+      <w:r>
+        <w:t xml:space="preserve"> </w:t>
+      </w:r>
+      <w:r>
+        <w:rPr>
+          <w:rStyle w:val="VerbatimChar"/>
+        </w:rPr>
+        <w:t xml:space="preserve">ShotCount</w:t>
+      </w:r>
+      <w:r>
+        <w:t xml:space="preserve"> </w:t>
+      </w:r>
+      <w:r>
+        <w:t xml:space="preserve">= total shots through cavity A so far today, cumulative</w:t>
+      </w:r>
+      <w:r>
+        <w:t xml:space="preserve"> </w:t>
+      </w:r>
+      <w:r>
+        <w:rPr>
+          <w:rStyle w:val="VerbatimChar"/>
+        </w:rPr>
+        <w:t xml:space="preserve">ScrapCount</w:t>
+      </w:r>
+      <w:r>
+        <w:t xml:space="preserve"> </w:t>
+      </w:r>
+      <w:r>
+        <w:t xml:space="preserve">= 3 (that porosity run earlier).</w:t>
+      </w:r>
+    </w:p>
+    <w:p>
+      <w:pPr>
+        <w:pStyle w:val="BodyText"/>
+      </w:pPr>
+      <w:r>
+        <w:t xml:space="preserve">The cavity-B basket fills on its own rhythm. Later — maybe 40 minutes, maybe two hours — Carlos logs it separately. It gets its own LOT (e.g.,</w:t>
+      </w:r>
+      <w:r>
+        <w:t xml:space="preserve"> </w:t>
+      </w:r>
+      <w:r>
+        <w:rPr>
+          <w:rStyle w:val="VerbatimChar"/>
+        </w:rPr>
+        <w:t xml:space="preserve">MESL1710936</w:t>
+      </w:r>
+      <w:r>
+        <w:t xml:space="preserve">), its own</w:t>
+      </w:r>
+      <w:r>
+        <w:t xml:space="preserve"> </w:t>
+      </w:r>
+      <w:r>
+        <w:rPr>
+          <w:rStyle w:val="VerbatimChar"/>
+        </w:rPr>
+        <w:t xml:space="preserve">ToolCavityId = Cavity B</w:t>
+      </w:r>
+      <w:r>
+        <w:t xml:space="preserve">, its own LTT label.</w:t>
+      </w:r>
+      <w:r>
+        <w:t xml:space="preserve"> </w:t>
+      </w:r>
+      <w:r>
+        <w:rPr>
+          <w:b/>
+          <w:bCs/>
+        </w:rPr>
+        <w:t xml:space="preserve">The two LOTs are peers, not sublots.</w:t>
+      </w:r>
+      <w:r>
+        <w:t xml:space="preserve"> </w:t>
+      </w:r>
+      <w:r>
+        <w:t xml:space="preserve">They share a Tool but nothing else. Each fills independently. Each closes independently via an explicit</w:t>
+      </w:r>
+      <w:r>
+        <w:t xml:space="preserve"> </w:t>
+      </w:r>
+      <w:r>
+        <w:t xml:space="preserve">“Complete + Move”</w:t>
+      </w:r>
+      <w:r>
+        <w:t xml:space="preserve"> </w:t>
+      </w:r>
+      <w:r>
+        <w:t xml:space="preserve">when Carlos walks the finished basket away from the machine.</w:t>
+      </w:r>
+    </w:p>
+    <w:p>
+      <w:pPr>
+        <w:pStyle w:val="BodyText"/>
+      </w:pPr>
+      <w:r>
+        <w:t xml:space="preserve">Carlos had 3 no-good parts from an earlier shot — porosity. The</w:t>
+      </w:r>
+      <w:r>
+        <w:t xml:space="preserve"> </w:t>
+      </w:r>
+      <w:r>
+        <w:rPr>
+          <w:rStyle w:val="VerbatimChar"/>
+        </w:rPr>
+        <w:t xml:space="preserve">ScrapCount</w:t>
+      </w:r>
+      <w:r>
+        <w:t xml:space="preserve"> </w:t>
+      </w:r>
+      <w:r>
+        <w:t xml:space="preserve">on this first checkpoint already reflects them (cumulative counter). Against that ProductionEvent he also records a</w:t>
+      </w:r>
+      <w:r>
+        <w:t xml:space="preserve"> </w:t>
+      </w:r>
+      <w:r>
+        <w:rPr>
+          <w:rStyle w:val="VerbatimChar"/>
+        </w:rPr>
+        <w:t xml:space="preserve">RejectEvent</w:t>
+      </w:r>
+      <w:r>
+        <w:t xml:space="preserve"> </w:t>
+      </w:r>
+      <w:r>
+        <w:t xml:space="preserve">with defect code DC-POR-01 quantity 3. Per FRS Section 4, reject/scrap data is retained for analysis but is not considered part of the permanent production record in the same way good counts are — MPP may elect not to record rejects at every manufacturing step.</w:t>
+      </w:r>
+    </w:p>
+    <w:p>
+      <w:pPr>
+        <w:pStyle w:val="BodyText"/>
+      </w:pPr>
+      <w:r>
+        <w:t xml:space="preserve">He has a downtime event too — the die stuck at 6:45am, took 12 minutes to clear. He logs it: reason code EQ-DIE-STICK, start 6:45, end 6:57. If the PLC had detected it first, the</w:t>
+      </w:r>
+      <w:r>
+        <w:t xml:space="preserve"> </w:t>
+      </w:r>
+      <w:r>
+        <w:rPr>
+          <w:rStyle w:val="VerbatimChar"/>
+        </w:rPr>
+        <w:t xml:space="preserve">DowntimeEvent</w:t>
+      </w:r>
+      <w:r>
+        <w:t xml:space="preserve"> </w:t>
+      </w:r>
+      <w:r>
+        <w:t xml:space="preserve">would have been created automatically with source=PLC, and Carlos would just need to assign the reason code. Note: the legacy paper forms track downtime as cumulative minutes subtracted from a 425-minute base runtime — the clerk types</w:t>
+      </w:r>
+      <w:r>
+        <w:t xml:space="preserve"> </w:t>
+      </w:r>
+      <w:r>
+        <w:t xml:space="preserve">“425 − 30 lunch − 15 break = 380.”</w:t>
+      </w:r>
+      <w:r>
+        <w:t xml:space="preserve"> </w:t>
+      </w:r>
+      <w:r>
+        <w:t xml:space="preserve">The MES never accepts a raw total. Instead: machine stoppages like this one are logged as discrete</w:t>
+      </w:r>
+      <w:r>
+        <w:t xml:space="preserve"> </w:t>
+      </w:r>
+      <w:r>
+        <w:rPr>
+          <w:rStyle w:val="VerbatimChar"/>
+        </w:rPr>
+        <w:t xml:space="preserve">DowntimeEvent</w:t>
+      </w:r>
+      <w:r>
+        <w:t xml:space="preserve"> </w:t>
+      </w:r>
+      <w:r>
+        <w:t xml:space="preserve">rows with actual start/end timestamps. Lunch and breaks are handled differently — at the end of the shift, operators confirm which breaks they took via button-toggle selection (FDS-09-013); the MES writes the corresponding</w:t>
+      </w:r>
+      <w:r>
+        <w:t xml:space="preserve"> </w:t>
+      </w:r>
+      <w:r>
+        <w:rPr>
+          <w:rStyle w:val="VerbatimChar"/>
+        </w:rPr>
+        <w:t xml:space="preserve">DowntimeEvent</w:t>
+      </w:r>
+      <w:r>
+        <w:t xml:space="preserve"> </w:t>
+      </w:r>
+      <w:r>
+        <w:t xml:space="preserve">rows using start times and durations from the shift schedule configuration, not from operator keystrokes. Available shift time = scheduled shift duration − sum of all</w:t>
+      </w:r>
+      <w:r>
+        <w:t xml:space="preserve"> </w:t>
+      </w:r>
+      <w:r>
+        <w:rPr>
+          <w:rStyle w:val="VerbatimChar"/>
+        </w:rPr>
+        <w:t xml:space="preserve">DowntimeEvent</w:t>
+      </w:r>
+      <w:r>
+        <w:t xml:space="preserve"> </w:t>
+      </w:r>
+      <w:r>
+        <w:t xml:space="preserve">durations in the window. The cumulative total is always derived from event records, never entered as a number.</w:t>
+      </w:r>
+    </w:p>
+    <w:p>
+      <w:pPr>
         <w:pStyle w:val="CaptionedFigure"/>
       </w:pPr>
       <w:r>
         <w:drawing>
           <wp:inline>
-            <wp:extent cx="5334000" cy="3657365"/>
+            <wp:extent cx="5334000" cy="3910068"/>
             <wp:effectExtent b="0" l="0" r="0" t="0"/>
-            <wp:docPr descr="Change Active Cell modal — shared terminal context selector" title="" id="94" name="Picture"/>
+            <wp:docPr descr="Downtime Events modal — Press 7, 4 events this shift, 1 open" title="" id="94" name="Picture"/>
             <a:graphic>
               <a:graphicData uri="http://schemas.openxmlformats.org/drawingml/2006/picture">
                 <pic:pic>
                   <pic:nvPicPr>
-                    <pic:cNvPr descr="mockup_screenshots/Screenshot%202026-04-30%20123743.png" id="95" name="Picture"/>
+                    <pic:cNvPr descr="mockup_screenshots/Screenshot%202026-05-04%20105438.png" id="95" name="Picture"/>
                     <pic:cNvPicPr>
                       <a:picLocks noChangeArrowheads="1" noChangeAspect="1"/>
                     </pic:cNvPicPr>
@@ -4888,7 +5226,7 @@
                   <pic:spPr bwMode="auto">
                     <a:xfrm>
                       <a:off x="0" y="0"/>
-                      <a:ext cx="5334000" cy="3657365"/>
+                      <a:ext cx="5334000" cy="3910068"/>
                     </a:xfrm>
                     <a:prstGeom prst="rect">
                       <a:avLst/>
@@ -4912,7 +5250,7 @@
         <w:pStyle w:val="ImageCaption"/>
       </w:pPr>
       <w:r>
-        <w:t xml:space="preserve">Change Active Cell modal — shared terminal context selector</w:t>
+        <w:t xml:space="preserve">Downtime Events modal — Press 7, 4 events this shift, 1 open</w:t>
       </w:r>
     </w:p>
     <w:p>
@@ -4924,268 +5262,7 @@
           <w:i/>
           <w:iCs/>
         </w:rPr>
-        <w:t xml:space="preserve">Change Active Cell modal: operator scans a Cell barcode or picks from a dropdown showing descendant Cells of the terminal’s parent Location. All dependent fields (Tool, Cavity, FIFO queue, etc.) refresh on confirmation.</w:t>
-      </w:r>
-    </w:p>
-    <w:p>
-      <w:pPr>
-        <w:pStyle w:val="BodyText"/>
-      </w:pPr>
-      <w:r>
-        <w:t xml:space="preserve">A LOT is created —</w:t>
-      </w:r>
-      <w:r>
-        <w:t xml:space="preserve"> </w:t>
-      </w:r>
-      <w:r>
-        <w:rPr>
-          <w:rStyle w:val="VerbatimChar"/>
-        </w:rPr>
-        <w:t xml:space="preserve">LotName</w:t>
-      </w:r>
-      <w:r>
-        <w:t xml:space="preserve"> </w:t>
-      </w:r>
-      <w:r>
-        <w:t xml:space="preserve">minted via</w:t>
-      </w:r>
-      <w:r>
-        <w:t xml:space="preserve"> </w:t>
-      </w:r>
-      <w:r>
-        <w:rPr>
-          <w:rStyle w:val="VerbatimChar"/>
-        </w:rPr>
-        <w:t xml:space="preserve">Lots.IdentifierSequence_Next @Code='Lot'</w:t>
-      </w:r>
-      <w:r>
-        <w:t xml:space="preserve"> </w:t>
-      </w:r>
-      <w:r>
-        <w:t xml:space="preserve">which returns</w:t>
-      </w:r>
-      <w:r>
-        <w:t xml:space="preserve"> </w:t>
-      </w:r>
-      <w:r>
-        <w:rPr>
-          <w:rStyle w:val="VerbatimChar"/>
-        </w:rPr>
-        <w:t xml:space="preserve">MESL1710935</w:t>
-      </w:r>
-      <w:r>
-        <w:t xml:space="preserve"> </w:t>
-      </w:r>
-      <w:r>
-        <w:t xml:space="preserve">(the counter continues from the Flexware cutover seed).</w:t>
-      </w:r>
-      <w:r>
-        <w:t xml:space="preserve"> </w:t>
-      </w:r>
-      <w:r>
-        <w:rPr>
-          <w:rStyle w:val="VerbatimChar"/>
-        </w:rPr>
-        <w:t xml:space="preserve">ToolId</w:t>
-      </w:r>
-      <w:r>
-        <w:t xml:space="preserve"> </w:t>
-      </w:r>
-      <w:r>
-        <w:t xml:space="preserve">points at DC-042.</w:t>
-      </w:r>
-      <w:r>
-        <w:t xml:space="preserve"> </w:t>
-      </w:r>
-      <w:r>
-        <w:rPr>
-          <w:rStyle w:val="VerbatimChar"/>
-        </w:rPr>
-        <w:t xml:space="preserve">ToolCavityId</w:t>
-      </w:r>
-      <w:r>
-        <w:t xml:space="preserve"> </w:t>
-      </w:r>
-      <w:r>
-        <w:t xml:space="preserve">points at Cavity A. Origin: Manufactured. Status: Good. Location: Machine #7. A first</w:t>
-      </w:r>
-      <w:r>
-        <w:t xml:space="preserve"> </w:t>
-      </w:r>
-      <w:r>
-        <w:rPr>
-          <w:rStyle w:val="VerbatimChar"/>
-        </w:rPr>
-        <w:t xml:space="preserve">Workorder.ProductionEvent</w:t>
-      </w:r>
-      <w:r>
-        <w:t xml:space="preserve"> </w:t>
-      </w:r>
-      <w:r>
-        <w:t xml:space="preserve">checkpoint row is written with cumulative</w:t>
-      </w:r>
-      <w:r>
-        <w:t xml:space="preserve"> </w:t>
-      </w:r>
-      <w:r>
-        <w:rPr>
-          <w:rStyle w:val="VerbatimChar"/>
-        </w:rPr>
-        <w:t xml:space="preserve">ShotCount</w:t>
-      </w:r>
-      <w:r>
-        <w:t xml:space="preserve"> </w:t>
-      </w:r>
-      <w:r>
-        <w:t xml:space="preserve">= total shots through cavity A so far today, cumulative</w:t>
-      </w:r>
-      <w:r>
-        <w:t xml:space="preserve"> </w:t>
-      </w:r>
-      <w:r>
-        <w:rPr>
-          <w:rStyle w:val="VerbatimChar"/>
-        </w:rPr>
-        <w:t xml:space="preserve">ScrapCount</w:t>
-      </w:r>
-      <w:r>
-        <w:t xml:space="preserve"> </w:t>
-      </w:r>
-      <w:r>
-        <w:t xml:space="preserve">= 3 (that porosity run earlier). Since this is the LOT’s first event, there’s no previous event to diff against yet — the next event will compute its delta via</w:t>
-      </w:r>
-      <w:r>
-        <w:t xml:space="preserve"> </w:t>
-      </w:r>
-      <w:r>
-        <w:rPr>
-          <w:rStyle w:val="VerbatimChar"/>
-        </w:rPr>
-        <w:t xml:space="preserve">LAG(ShotCount) OVER (PARTITION BY LotId ORDER BY EventAt)</w:t>
-      </w:r>
-      <w:r>
-        <w:t xml:space="preserve">.</w:t>
-      </w:r>
-    </w:p>
-    <w:p>
-      <w:pPr>
-        <w:pStyle w:val="BodyText"/>
-      </w:pPr>
-      <w:r>
-        <w:t xml:space="preserve">The cavity-B basket fills on its own rhythm. Later — maybe 40 minutes, maybe two hours — Carlos logs it separately. It gets its own LOT (e.g.,</w:t>
-      </w:r>
-      <w:r>
-        <w:t xml:space="preserve"> </w:t>
-      </w:r>
-      <w:r>
-        <w:rPr>
-          <w:rStyle w:val="VerbatimChar"/>
-        </w:rPr>
-        <w:t xml:space="preserve">MESL1710936</w:t>
-      </w:r>
-      <w:r>
-        <w:t xml:space="preserve">), its own</w:t>
-      </w:r>
-      <w:r>
-        <w:t xml:space="preserve"> </w:t>
-      </w:r>
-      <w:r>
-        <w:rPr>
-          <w:rStyle w:val="VerbatimChar"/>
-        </w:rPr>
-        <w:t xml:space="preserve">ToolCavityId = Cavity B</w:t>
-      </w:r>
-      <w:r>
-        <w:t xml:space="preserve">, its own LTT label.</w:t>
-      </w:r>
-      <w:r>
-        <w:t xml:space="preserve"> </w:t>
-      </w:r>
-      <w:r>
-        <w:rPr>
-          <w:b/>
-          <w:bCs/>
-        </w:rPr>
-        <w:t xml:space="preserve">The two LOTs are peers, not sublots.</w:t>
-      </w:r>
-      <w:r>
-        <w:t xml:space="preserve"> </w:t>
-      </w:r>
-      <w:r>
-        <w:t xml:space="preserve">They share a Tool but nothing else. Each fills independently. Each closes independently via an explicit</w:t>
-      </w:r>
-      <w:r>
-        <w:t xml:space="preserve"> </w:t>
-      </w:r>
-      <w:r>
-        <w:t xml:space="preserve">“Complete + Move”</w:t>
-      </w:r>
-      <w:r>
-        <w:t xml:space="preserve"> </w:t>
-      </w:r>
-      <w:r>
-        <w:t xml:space="preserve">when Carlos walks the finished basket away from the machine.</w:t>
-      </w:r>
-    </w:p>
-    <w:p>
-      <w:pPr>
-        <w:pStyle w:val="BodyText"/>
-      </w:pPr>
-      <w:r>
-        <w:t xml:space="preserve">Carlos had 3 no-good parts from an earlier shot — porosity. The</w:t>
-      </w:r>
-      <w:r>
-        <w:t xml:space="preserve"> </w:t>
-      </w:r>
-      <w:r>
-        <w:rPr>
-          <w:rStyle w:val="VerbatimChar"/>
-        </w:rPr>
-        <w:t xml:space="preserve">ScrapCount</w:t>
-      </w:r>
-      <w:r>
-        <w:t xml:space="preserve"> </w:t>
-      </w:r>
-      <w:r>
-        <w:t xml:space="preserve">on this first checkpoint already reflects them (cumulative counter). Against that ProductionEvent he also records a</w:t>
-      </w:r>
-      <w:r>
-        <w:t xml:space="preserve"> </w:t>
-      </w:r>
-      <w:r>
-        <w:rPr>
-          <w:rStyle w:val="VerbatimChar"/>
-        </w:rPr>
-        <w:t xml:space="preserve">RejectEvent</w:t>
-      </w:r>
-      <w:r>
-        <w:t xml:space="preserve"> </w:t>
-      </w:r>
-      <w:r>
-        <w:t xml:space="preserve">with defect code DC-POR-01 quantity 3. Per FRS Section 4, reject/scrap data is retained for analysis but is not considered part of the permanent production record in the same way good counts are — MPP may elect not to record rejects at every manufacturing step.</w:t>
-      </w:r>
-    </w:p>
-    <w:p>
-      <w:pPr>
-        <w:pStyle w:val="BodyText"/>
-      </w:pPr>
-      <w:r>
-        <w:t xml:space="preserve">He has a downtime event too — the die stuck at 6:45am, took 12 minutes to clear. He logs it: reason code EQ-DIE-STICK, start 6:45, end 6:57. If the PLC had detected it first, the</w:t>
-      </w:r>
-      <w:r>
-        <w:t xml:space="preserve"> </w:t>
-      </w:r>
-      <w:r>
-        <w:rPr>
-          <w:rStyle w:val="VerbatimChar"/>
-        </w:rPr>
-        <w:t xml:space="preserve">DowntimeEvent</w:t>
-      </w:r>
-      <w:r>
-        <w:t xml:space="preserve"> </w:t>
-      </w:r>
-      <w:r>
-        <w:t xml:space="preserve">would have been created automatically with source=PLC, and Carlos would just need to assign the reason code. Note: the legacy paper forms track downtime as cumulative minutes subtracted from a 425-minute base runtime (with adjustments for lunch, breaks, and overtime). The new MES captures discrete start/end events, which is a more granular model — the cumulative shift total is derived from the events rather than entered directly.</w:t>
+        <w:t xml:space="preserve">Downtime Events modal: header shows machine context (Press 7 · Die Cast Area) and open-event count. Table lists all shift events with Start Time, End Time (blank = still open), Reason Code, Initials, Remarks, and Shot Count (shown only for Setup-type events). Clicking a row expands an inline edit form — Start Time, End Time, Initials, Reason Code dropdown, Remarks. The open event (13:45, Cooling Issue) shows OPEN in amber with a left border indicator. + Add Event opens a new empty row at the bottom. Machine context is shown in the footer.</w:t>
       </w:r>
     </w:p>
     <w:bookmarkEnd w:id="96"/>
@@ -5339,7 +5416,7 @@
         <w:t xml:space="preserve"> </w:t>
       </w:r>
       <w:r>
-        <w:t xml:space="preserve">at the trim station — cumulative</w:t>
+        <w:t xml:space="preserve">at the trim station, recording cumulative</w:t>
       </w:r>
       <w:r>
         <w:t xml:space="preserve"> </w:t>
@@ -5369,49 +5446,7 @@
         <w:t xml:space="preserve"> </w:t>
       </w:r>
       <w:r>
-        <w:t xml:space="preserve">as-of-arrival. Because this is the LOT’s second event (the first was Carlos’s die-cast checkpoint), deltas pop out immediately from the reader’s</w:t>
-      </w:r>
-      <w:r>
-        <w:t xml:space="preserve"> </w:t>
-      </w:r>
-      <w:r>
-        <w:rPr>
-          <w:rStyle w:val="VerbatimChar"/>
-        </w:rPr>
-        <w:t xml:space="preserve">LAG()</w:t>
-      </w:r>
-      <w:r>
-        <w:t xml:space="preserve"> </w:t>
-      </w:r>
-      <w:r>
-        <w:t xml:space="preserve">window:</w:t>
-      </w:r>
-      <w:r>
-        <w:t xml:space="preserve"> </w:t>
-      </w:r>
-      <w:r>
-        <w:t xml:space="preserve">“since last event, this LOT accumulated X shots and Y scrap.”</w:t>
-      </w:r>
-      <w:r>
-        <w:t xml:space="preserve"> </w:t>
-      </w:r>
-      <w:r>
-        <w:t xml:space="preserve">Reports that want operator-facing per-event deltas SHALL compute them that way rather than storing per-event</w:t>
-      </w:r>
-      <w:r>
-        <w:t xml:space="preserve"> </w:t>
-      </w:r>
-      <w:r>
-        <w:rPr>
-          <w:rStyle w:val="VerbatimChar"/>
-        </w:rPr>
-        <w:t xml:space="preserve">GoodCount</w:t>
-      </w:r>
-      <w:r>
-        <w:t xml:space="preserve"> </w:t>
-      </w:r>
-      <w:r>
-        <w:t xml:space="preserve">on the event row. Checkpoints are coarse — operators aren’t at the terminal per shot, they log at natural breakpoints (basket close, area handoff, complete+move).</w:t>
+        <w:t xml:space="preserve">as-of-arrival. Checkpoints are coarse — operators log at natural breakpoints (basket close, area handoff, complete+move), not per shot.</w:t>
       </w:r>
     </w:p>
     <w:p>
@@ -6340,155 +6375,49 @@
           <w:b/>
           <w:bCs/>
         </w:rPr>
-        <w:t xml:space="preserve">Machining OUT — event-driven (FDS-06-008).</w:t>
-      </w:r>
-      <w:r>
-        <w:t xml:space="preserve"> </w:t>
-      </w:r>
-      <w:r>
-        <w:t xml:space="preserve">When the machine signals completion of the operation on the LOT (PLC</w:t>
-      </w:r>
-      <w:r>
-        <w:t xml:space="preserve"> </w:t>
-      </w:r>
-      <w:r>
-        <w:rPr>
-          <w:rStyle w:val="VerbatimChar"/>
-        </w:rPr>
-        <w:t xml:space="preserve">OperationComplete</w:t>
-      </w:r>
-      <w:r>
-        <w:t xml:space="preserve"> </w:t>
-      </w:r>
-      <w:r>
-        <w:t xml:space="preserve">tag asserts), the MES does this</w:t>
-      </w:r>
-      <w:r>
-        <w:t xml:space="preserve"> </w:t>
-      </w:r>
+        <w:t xml:space="preserve">Machining OUT — two possible paths.</w:t>
+      </w:r>
+      <w:r>
+        <w:t xml:space="preserve"> </w:t>
+      </w:r>
+      <w:r>
+        <w:t xml:space="preserve">When the machining operation completes, one of two things happens depending on how the cell is configured:</w:t>
+      </w:r>
+    </w:p>
+    <w:p>
+      <w:pPr>
+        <w:pStyle w:val="BodyText"/>
+      </w:pPr>
       <w:r>
         <w:rPr>
           <w:b/>
           <w:bCs/>
         </w:rPr>
-        <w:t xml:space="preserve">without operator action</w:t>
-      </w:r>
-      <w:r>
-        <w:t xml:space="preserve">: writes a checkpoint</w:t>
-      </w:r>
-      <w:r>
-        <w:t xml:space="preserve"> </w:t>
-      </w:r>
-      <w:r>
-        <w:rPr>
-          <w:rStyle w:val="VerbatimChar"/>
-        </w:rPr>
-        <w:t xml:space="preserve">ProductionEvent</w:t>
-      </w:r>
-      <w:r>
-        <w:t xml:space="preserve"> </w:t>
-      </w:r>
-      <w:r>
-        <w:t xml:space="preserve">capturing cumulative</w:t>
-      </w:r>
-      <w:r>
-        <w:t xml:space="preserve"> </w:t>
-      </w:r>
-      <w:r>
-        <w:rPr>
-          <w:rStyle w:val="VerbatimChar"/>
-        </w:rPr>
-        <w:t xml:space="preserve">ShotCount</w:t>
-      </w:r>
-      <w:r>
-        <w:t xml:space="preserve"> </w:t>
-      </w:r>
-      <w:r>
-        <w:t xml:space="preserve">and</w:t>
-      </w:r>
-      <w:r>
-        <w:t xml:space="preserve"> </w:t>
-      </w:r>
-      <w:r>
-        <w:rPr>
-          <w:rStyle w:val="VerbatimChar"/>
-        </w:rPr>
-        <w:t xml:space="preserve">ScrapCount</w:t>
-      </w:r>
-      <w:r>
-        <w:t xml:space="preserve"> </w:t>
-      </w:r>
-      <w:r>
-        <w:t xml:space="preserve">as-of-completion; reads the</w:t>
-      </w:r>
-      <w:r>
-        <w:t xml:space="preserve"> </w:t>
-      </w:r>
-      <w:r>
-        <w:rPr>
-          <w:rStyle w:val="VerbatimChar"/>
-        </w:rPr>
-        <w:t xml:space="preserve">CoupledDownstreamCellLocationId</w:t>
-      </w:r>
-      <w:r>
-        <w:t xml:space="preserve"> </w:t>
-      </w:r>
-      <w:r>
-        <w:t xml:space="preserve">LocationAttribute on this Machining Cell (configured at deployment to point at the paired Assembly Cell within the same WorkCenter); writes a</w:t>
-      </w:r>
-      <w:r>
-        <w:t xml:space="preserve"> </w:t>
-      </w:r>
-      <w:r>
-        <w:rPr>
-          <w:rStyle w:val="VerbatimChar"/>
-        </w:rPr>
-        <w:t xml:space="preserve">LotMovement</w:t>
-      </w:r>
-      <w:r>
-        <w:t xml:space="preserve"> </w:t>
-      </w:r>
-      <w:r>
-        <w:t xml:space="preserve">from this Machining Cell to the coupled downstream Cell; updates the LOT’s</w:t>
-      </w:r>
-      <w:r>
-        <w:t xml:space="preserve"> </w:t>
-      </w:r>
-      <w:r>
-        <w:rPr>
-          <w:rStyle w:val="VerbatimChar"/>
-        </w:rPr>
-        <w:t xml:space="preserve">CurrentLocationId</w:t>
-      </w:r>
-      <w:r>
-        <w:t xml:space="preserve">. The operator never scans Machining OUT — the basket physically rolls to Assembly while the MES records the move. (When</w:t>
-      </w:r>
-      <w:r>
-        <w:t xml:space="preserve"> </w:t>
-      </w:r>
-      <w:r>
-        <w:rPr>
-          <w:rStyle w:val="VerbatimChar"/>
-        </w:rPr>
-        <w:t xml:space="preserve">CoupledDownstreamCellLocationId</w:t>
-      </w:r>
-      <w:r>
-        <w:t xml:space="preserve"> </w:t>
-      </w:r>
-      <w:r>
-        <w:t xml:space="preserve">is NULL — uncoupled / legacy path — completion writes only the</w:t>
-      </w:r>
-      <w:r>
-        <w:t xml:space="preserve"> </w:t>
-      </w:r>
-      <w:r>
-        <w:rPr>
-          <w:rStyle w:val="VerbatimChar"/>
-        </w:rPr>
-        <w:t xml:space="preserve">ProductionEvent</w:t>
-      </w:r>
-      <w:r>
-        <w:t xml:space="preserve">, and the LOT stays at the Machining Cell awaiting an operator-driven movement.)</w:t>
+        <w:t xml:space="preserve">Path A — PLC-driven auto-move (FDS-06-008).</w:t>
+      </w:r>
+      <w:r>
+        <w:t xml:space="preserve"> </w:t>
+      </w:r>
+      <w:r>
+        <w:t xml:space="preserve">If the cell is integrated with a PLC and has a coupled downstream assembly cell configured, the machine signals completion and the MES automatically records the operation completion and moves the LOT to the paired Assembly Cell. The operator never touches the terminal for Machining OUT — the basket physically rolls to Assembly and the MES has already recorded the move.</w:t>
+      </w:r>
+    </w:p>
+    <w:p>
+      <w:pPr>
+        <w:pStyle w:val="BodyText"/>
+      </w:pPr>
+      <w:r>
+        <w:rPr>
+          <w:b/>
+          <w:bCs/>
+        </w:rPr>
+        <w:t xml:space="preserve">Path B — Operator-driven movement.</w:t>
+      </w:r>
+      <w:r>
+        <w:t xml:space="preserve"> </w:t>
+      </w:r>
+      <w:r>
+        <w:t xml:space="preserve">If there is no PLC integration, or the cell is not paired with a downstream cell, the MES records the operation completion but the LOT stays at the Machining Cell. An operator must manually scan the LOT at the next station to trigger the movement — the same scan-to-receive pattern used at Trim IN.</w:t>
       </w:r>
     </w:p>
     <w:bookmarkEnd w:id="119"/>
@@ -6868,22 +6797,23 @@
         <w:t xml:space="preserve">ContainerConfig</w:t>
       </w:r>
       <w:r>
-        <w:t xml:space="preserve">), the MES closes the container and calls AIM — Honda’s EDI system — to get a shipping ID.</w:t>
-      </w:r>
-      <w:r>
-        <w:t xml:space="preserve"> </w:t>
-      </w:r>
-      <w:r>
-        <w:rPr>
-          <w:rStyle w:val="VerbatimChar"/>
-        </w:rPr>
-        <w:t xml:space="preserve">GetNextNumber</w:t>
-      </w:r>
-      <w:r>
-        <w:t xml:space="preserve"> </w:t>
-      </w:r>
-      <w:r>
-        <w:t xml:space="preserve">returns shipper ID</w:t>
+        <w:t xml:space="preserve">), the MES closes the container and claims a shipper ID from its</w:t>
+      </w:r>
+      <w:r>
+        <w:t xml:space="preserve"> </w:t>
+      </w:r>
+      <w:r>
+        <w:rPr>
+          <w:b/>
+          <w:bCs/>
+        </w:rPr>
+        <w:t xml:space="preserve">local pool of pre-fetched AIM IDs</w:t>
+      </w:r>
+      <w:r>
+        <w:t xml:space="preserve"> </w:t>
+      </w:r>
+      <w:r>
+        <w:t xml:space="preserve">—</w:t>
       </w:r>
       <w:r>
         <w:t xml:space="preserve"> </w:t>
@@ -6895,7 +6825,7 @@
         <w:t xml:space="preserve">SH-240406-0089</w:t>
       </w:r>
       <w:r>
-        <w:t xml:space="preserve">. The Zebra prints a ZPL shipping label. The</w:t>
+        <w:t xml:space="preserve">. The container close never waits on a live AIM call; the pool is kept topped up in the background between container closes. The Zebra prints a ZPL shipping label. The</w:t>
       </w:r>
       <w:r>
         <w:t xml:space="preserve"> </w:t>
@@ -7598,7 +7528,7 @@
         <w:pStyle w:val="FirstParagraph"/>
       </w:pPr>
       <w:r>
-        <w:t xml:space="preserve">After investigation, Diane determines the issue is isolated to cavity A of die #42, from yesterday’s second shift only. From her desk she clicks the</w:t>
+        <w:t xml:space="preserve">After investigation, Diane determines the issue is isolated to cavity A of die #42, from yesterday’s second shift only. From her desk she opens the</w:t>
       </w:r>
       <w:r>
         <w:t xml:space="preserve"> </w:t>
@@ -7608,13 +7538,13 @@
           <w:b/>
           <w:bCs/>
         </w:rPr>
-        <w:t xml:space="preserve">Track</w:t>
-      </w:r>
-      <w:r>
-        <w:t xml:space="preserve"> </w:t>
-      </w:r>
-      <w:r>
-        <w:t xml:space="preserve">tile on the MES home page (FDS-12-012), types in one of the Honda-reported serial numbers, and immediately sees the full genealogy tree — cavity, die, Carlos, timestamp, and forward through to the containers and shipper IDs where that serial landed.</w:t>
+        <w:t xml:space="preserve">LOT Search tab</w:t>
+      </w:r>
+      <w:r>
+        <w:t xml:space="preserve"> </w:t>
+      </w:r>
+      <w:r>
+        <w:t xml:space="preserve">on the Plant Floor home page, searches by one of the Honda-reported serial numbers, and opens the matching LOT. From there she pulls up the full genealogy tree — cavity, die, Carlos, timestamp, and forward through to the containers and shipper IDs where that serial landed.</w:t>
       </w:r>
     </w:p>
     <w:p>
@@ -7926,14 +7856,14 @@
       <w:r>
         <w:drawing>
           <wp:inline>
-            <wp:extent cx="5334000" cy="2636376"/>
+            <wp:extent cx="5334000" cy="2653080"/>
             <wp:effectExtent b="0" l="0" r="0" t="0"/>
             <wp:docPr descr="Sort Cage Workflow — Serialized, per-serial migration" title="" id="147" name="Picture"/>
             <a:graphic>
               <a:graphicData uri="http://schemas.openxmlformats.org/drawingml/2006/picture">
                 <pic:pic>
                   <pic:nvPicPr>
-                    <pic:cNvPr descr="mockup_screenshots/Screenshot%202026-04-30%20125013.png" id="148" name="Picture"/>
+                    <pic:cNvPr descr="mockup_screenshots/Screenshot%202026-04-30%20125038.png" id="148" name="Picture"/>
                     <pic:cNvPicPr>
                       <a:picLocks noChangeArrowheads="1" noChangeAspect="1"/>
                     </pic:cNvPicPr>
@@ -7947,7 +7877,7 @@
                   <pic:spPr bwMode="auto">
                     <a:xfrm>
                       <a:off x="0" y="0"/>
-                      <a:ext cx="5334000" cy="2636376"/>
+                      <a:ext cx="5334000" cy="2653080"/>
                     </a:xfrm>
                     <a:prstGeom prst="rect">
                       <a:avLst/>
@@ -7983,7 +7913,7 @@
           <w:i/>
           <w:iCs/>
         </w:rPr>
-        <w:t xml:space="preserve">Sort Cage Workflow (serialized, UJ-05 update-in-place default): Source Container header (Container, AIM Shipper ID, Item, Total Serials). Per-Serial Migration table — each row shows a serial number and a Destination Container · Tray · Position dropdown; PASS/FAIL badge. Suspect-only filter and Select All button for bulk operations. Submit Bulk Migration commits all rows in one call; ShippingLabel_Void fires on the source, Container_Complete fires on the destination claiming a fresh AIM ID.</w:t>
+        <w:t xml:space="preserve">Sort Cage Workflow (serialized, UJ-05 update-in-place default): Source Container header (Container, AIM Shipper ID, Item, Total Serials). Per-Serial Migration table — each row shows a serial number and a Destination Container · Tray · Position dropdown; PASS/FAIL badge. Suspect-only filter and Select All button for bulk operations. Submit Bulk Migration commits all rows in one call; shipping label on the source is voided, destination container completes claiming a fresh AIM ID from the local pool.</w:t>
       </w:r>
     </w:p>
     <w:p>
@@ -7993,14 +7923,14 @@
       <w:r>
         <w:drawing>
           <wp:inline>
-            <wp:extent cx="5334000" cy="2653080"/>
+            <wp:extent cx="5334000" cy="2646153"/>
             <wp:effectExtent b="0" l="0" r="0" t="0"/>
             <wp:docPr descr="Sort Cage Workflow — Non-Serialized, ByVision camera re-pack" title="" id="150" name="Picture"/>
             <a:graphic>
               <a:graphicData uri="http://schemas.openxmlformats.org/drawingml/2006/picture">
                 <pic:pic>
                   <pic:nvPicPr>
-                    <pic:cNvPr descr="mockup_screenshots/Screenshot%202026-04-30%20125038.png" id="151" name="Picture"/>
+                    <pic:cNvPr descr="mockup_screenshots/Screenshot%202026-04-30%20125103.png" id="151" name="Picture"/>
                     <pic:cNvPicPr>
                       <a:picLocks noChangeArrowheads="1" noChangeAspect="1"/>
                     </pic:cNvPicPr>
@@ -8014,7 +7944,7 @@
                   <pic:spPr bwMode="auto">
                     <a:xfrm>
                       <a:off x="0" y="0"/>
-                      <a:ext cx="5334000" cy="2653080"/>
+                      <a:ext cx="5334000" cy="2646153"/>
                     </a:xfrm>
                     <a:prstGeom prst="rect">
                       <a:avLst/>
@@ -8360,14 +8290,14 @@
       <w:r>
         <w:drawing>
           <wp:inline>
-            <wp:extent cx="5334000" cy="2646153"/>
+            <wp:extent cx="5334000" cy="2655875"/>
             <wp:effectExtent b="0" l="0" r="0" t="0"/>
             <wp:docPr descr="Shipping Dock — active manifest TRUCK-MFG-240430-002" title="" id="158" name="Picture"/>
             <a:graphic>
               <a:graphicData uri="http://schemas.openxmlformats.org/drawingml/2006/picture">
                 <pic:pic>
                   <pic:nvPicPr>
-                    <pic:cNvPr descr="mockup_screenshots/Screenshot%202026-04-30%20125103.png" id="159" name="Picture"/>
+                    <pic:cNvPr descr="mockup_screenshots/Screenshot%202026-04-30%20125124.png" id="159" name="Picture"/>
                     <pic:cNvPicPr>
                       <a:picLocks noChangeArrowheads="1" noChangeAspect="1"/>
                     </pic:cNvPicPr>
@@ -8381,7 +8311,7 @@
                   <pic:spPr bwMode="auto">
                     <a:xfrm>
                       <a:off x="0" y="0"/>
-                      <a:ext cx="5334000" cy="2646153"/>
+                      <a:ext cx="5334000" cy="2655875"/>
                     </a:xfrm>
                     <a:prstGeom prst="rect">
                       <a:avLst/>
@@ -8518,58 +8448,15 @@
           <w:i/>
           <w:iCs/>
         </w:rPr>
-        <w:t xml:space="preserve">End-of-Shift Time Entry screen: terminal mode badge (Dedicated · button-based, derived from parent Location tier per FDS-02-010). Three large toggle buttons — Lunch (30 min · 11:30 start), Break 1 (15 min · 09:00 start), Break 2 (15 min · 13:30 start) — tap to select, tap again to deselect. Submit Shift End writes one Oee.DowntimeEvent per selected break using shift-schedule start times and durations — no numeric entry. Zero-button submission valid. Shift Handover Summary below shows Open Downtime Events, Open Paused LOTs, and In-Process LOTs spanning the boundary.</w:t>
-      </w:r>
-      <w:r>
-        <w:t xml:space="preserve"> </w:t>
-      </w:r>
-      <w:r>
-        <w:t xml:space="preserve">His terminal is dedicated (Cell-parented), so the entry is a single button press: tap once, the MES writes</w:t>
-      </w:r>
-      <w:r>
-        <w:t xml:space="preserve"> </w:t>
-      </w:r>
-      <w:r>
-        <w:rPr>
-          <w:rStyle w:val="VerbatimChar"/>
-        </w:rPr>
-        <w:t xml:space="preserve">Oee.DowntimeEvent</w:t>
-      </w:r>
-      <w:r>
-        <w:t xml:space="preserve"> </w:t>
-      </w:r>
-      <w:r>
-        <w:t xml:space="preserve">rows for the lunch period and each break period defined on the shift schedule, with each row’s</w:t>
-      </w:r>
-      <w:r>
-        <w:t xml:space="preserve"> </w:t>
-      </w:r>
-      <w:r>
-        <w:rPr>
-          <w:rStyle w:val="VerbatimChar"/>
-        </w:rPr>
-        <w:t xml:space="preserve">StartedAt</w:t>
-      </w:r>
-      <w:r>
-        <w:t xml:space="preserve"> </w:t>
-      </w:r>
-      <w:r>
-        <w:t xml:space="preserve">/</w:t>
-      </w:r>
-      <w:r>
-        <w:t xml:space="preserve"> </w:t>
-      </w:r>
-      <w:r>
-        <w:rPr>
-          <w:rStyle w:val="VerbatimChar"/>
-        </w:rPr>
-        <w:t xml:space="preserve">EndedAt</w:t>
-      </w:r>
-      <w:r>
-        <w:t xml:space="preserve"> </w:t>
-      </w:r>
-      <w:r>
-        <w:t xml:space="preserve">populated from the schedule (no operator-entered durations, no minute-level adjustments). On a shared terminal it would prompt for initials, time category (Regular default), lunch yes/no, which breaks were taken, and submit. Either way the operator never types a number — they’re confirming what’s already configured.</w:t>
+        <w:t xml:space="preserve">End-of-Shift Time Entry screen: terminal mode badge (Dedicated · button-based, derived from parent Location tier per FDS-02-010). Three large toggle buttons — Lunch (30 min · 11:30 start), Break 1 (15 min · 09:00 start), Break 2 (15 min · 13:30 start) — tap to select, tap again to deselect. Submit Shift End writes one DowntimeEvent per selected break using shift-schedule start times and durations — no numeric entry. Zero-button submission valid. Shift Handover Summary below shows Open Downtime Events, Open Paused LOTs, and In-Process LOTs spanning the boundary.</w:t>
+      </w:r>
+    </w:p>
+    <w:p>
+      <w:pPr>
+        <w:pStyle w:val="BodyText"/>
+      </w:pPr>
+      <w:r>
+        <w:t xml:space="preserve">Carlos taps the breaks he actually took — on a dedicated terminal this is just the three toggle buttons, nothing else. Zero-button submission is valid: if he skipped all breaks, he submits with nothing selected and the MES writes no rows. On a shared terminal the same toggle buttons appear, plus an initials field and a time category selector (Regular / Overtime / Double-Time). Either way the operator never types a duration — they confirm which scheduled breaks were taken and the shift-schedule start times and durations supply the rest.</w:t>
       </w:r>
     </w:p>
     <w:p>
@@ -8853,13 +8740,13 @@
       </w:r>
     </w:p>
     <w:bookmarkEnd w:id="166"/>
-    <w:bookmarkStart w:id="167" w:name="X8a97f2b45aacffcfde53291572bcd0cf661d011"/>
+    <w:bookmarkStart w:id="167" w:name="lot-creation-flow-at-die-cast-resolved"/>
     <w:p>
       <w:pPr>
         <w:pStyle w:val="Heading3"/>
       </w:pPr>
       <w:r>
-        <w:t xml:space="preserve">2. LOT Creation Flow at Die Cast — 🔶 Pending Customer Validation</w:t>
+        <w:t xml:space="preserve">2. LOT Creation Flow at Die Cast — ✅ Resolved</w:t>
       </w:r>
     </w:p>
     <w:p>
@@ -8907,22 +8794,40 @@
           <w:b/>
           <w:bCs/>
         </w:rPr>
-        <w:t xml:space="preserve">Addendum (2026-04-23, v0.8):</w:t>
-      </w:r>
-      <w:r>
-        <w:t xml:space="preserve"> </w:t>
-      </w:r>
-      <w:r>
-        <w:t xml:space="preserve">LOT creation is</w:t>
-      </w:r>
-      <w:r>
-        <w:t xml:space="preserve"> </w:t>
-      </w:r>
+        <w:t xml:space="preserve">Decision (2026-04-24 — closed by Jacques):</w:t>
+      </w:r>
+      <w:r>
+        <w:t xml:space="preserve"> </w:t>
+      </w:r>
+      <w:r>
+        <w:t xml:space="preserve">Confirmed. FDS-05-002 + FDS-05-036 (lazy operator-driven creation) are authoritative.</w:t>
+      </w:r>
+    </w:p>
+    <w:p>
+      <w:pPr>
+        <w:pStyle w:val="BodyText"/>
+      </w:pPr>
       <w:r>
         <w:rPr>
           <w:b/>
           <w:bCs/>
         </w:rPr>
+        <w:t xml:space="preserve">Addendum (2026-04-23, v0.8):</w:t>
+      </w:r>
+      <w:r>
+        <w:t xml:space="preserve"> </w:t>
+      </w:r>
+      <w:r>
+        <w:t xml:space="preserve">LOT creation is</w:t>
+      </w:r>
+      <w:r>
+        <w:t xml:space="preserve"> </w:t>
+      </w:r>
+      <w:r>
+        <w:rPr>
+          <w:b/>
+          <w:bCs/>
+        </w:rPr>
         <w:t xml:space="preserve">lazy and operator-driven</w:t>
       </w:r>
       <w:r>
@@ -9428,13 +9333,13 @@
       </w:r>
     </w:p>
     <w:bookmarkEnd w:id="171"/>
-    <w:bookmarkStart w:id="172" w:name="work-order-visibility-and-lifecycle-open"/>
+    <w:bookmarkStart w:id="172" w:name="X22ad13e1333654c54764619e3c0aa4d63393197"/>
     <w:p>
       <w:pPr>
         <w:pStyle w:val="Heading3"/>
       </w:pPr>
       <w:r>
-        <w:t xml:space="preserve">7. Work Order Visibility and Lifecycle — ⬜ Open</w:t>
+        <w:t xml:space="preserve">7. Work Order Visibility and Lifecycle — ✅ Resolved</w:t>
       </w:r>
     </w:p>
     <w:p>
@@ -9495,61 +9400,106 @@
         <w:t xml:space="preserve">Maps to OI-07.</w:t>
       </w:r>
     </w:p>
-    <w:bookmarkEnd w:id="172"/>
-    <w:bookmarkStart w:id="173" w:name="lot-merge-business-rules-open"/>
-    <w:p>
-      <w:pPr>
-        <w:pStyle w:val="Heading3"/>
-      </w:pPr>
-      <w:r>
-        <w:t xml:space="preserve">8. LOT Merge Business Rules — ⬜ Open</w:t>
-      </w:r>
-    </w:p>
-    <w:p>
-      <w:pPr>
-        <w:pStyle w:val="FirstParagraph"/>
+    <w:p>
+      <w:pPr>
+        <w:pStyle w:val="BodyText"/>
       </w:pPr>
       <w:r>
         <w:rPr>
           <w:b/>
           <w:bCs/>
         </w:rPr>
-        <w:t xml:space="preserve">Assumption made:</w:t>
-      </w:r>
-      <w:r>
-        <w:t xml:space="preserve"> </w:t>
-      </w:r>
-      <w:r>
-        <w:t xml:space="preserve">Merges exist in the data model (</w:t>
-      </w:r>
-      <w:r>
-        <w:rPr>
-          <w:rStyle w:val="VerbatimChar"/>
-        </w:rPr>
-        <w:t xml:space="preserve">GenealogyRelationshipType</w:t>
-      </w:r>
-      <w:r>
-        <w:t xml:space="preserve"> </w:t>
-      </w:r>
-      <w:r>
-        <w:t xml:space="preserve">has MERGE) but the narrative skipped over them because the FRS explicitly says</w:t>
-      </w:r>
-      <w:r>
-        <w:t xml:space="preserve"> </w:t>
-      </w:r>
-      <w:r>
-        <w:t xml:space="preserve">“business rules TBD.”</w:t>
-      </w:r>
-    </w:p>
-    <w:p>
-      <w:pPr>
-        <w:pStyle w:val="BodyText"/>
+        <w:t xml:space="preserve">Decision (2026-04-27 — closed by Jacques, Option A):</w:t>
+      </w:r>
+      <w:r>
+        <w:t xml:space="preserve"> </w:t>
+      </w:r>
+      <w:r>
+        <w:t xml:space="preserve">Per-LOT WO auto-created at</w:t>
+      </w:r>
+      <w:r>
+        <w:t xml:space="preserve"> </w:t>
+      </w:r>
+      <w:r>
+        <w:rPr>
+          <w:rStyle w:val="VerbatimChar"/>
+        </w:rPr>
+        <w:t xml:space="preserve">Lot_Create</w:t>
+      </w:r>
+      <w:r>
+        <w:t xml:space="preserve">. Work orders are purely internal bookkeeping — never visible to operators. FDS-06-022 / FDS-06-024 are authoritative. ERP-derived WOs deferred — not in scope. The</w:t>
+      </w:r>
+      <w:r>
+        <w:t xml:space="preserve"> </w:t>
+      </w:r>
+      <w:r>
+        <w:rPr>
+          <w:rStyle w:val="VerbatimChar"/>
+        </w:rPr>
+        <w:t xml:space="preserve">WorkOrderTypeId</w:t>
+      </w:r>
+      <w:r>
+        <w:t xml:space="preserve"> </w:t>
+      </w:r>
+      <w:r>
+        <w:t xml:space="preserve">discriminator stays as a future hook for Demand / Maintenance types per OI-07.</w:t>
+      </w:r>
+    </w:p>
+    <w:bookmarkEnd w:id="172"/>
+    <w:bookmarkStart w:id="173" w:name="lot-merge-business-rules-resolved"/>
+    <w:p>
+      <w:pPr>
+        <w:pStyle w:val="Heading3"/>
+      </w:pPr>
+      <w:r>
+        <w:t xml:space="preserve">8. LOT Merge Business Rules — ✅ Resolved</w:t>
+      </w:r>
+    </w:p>
+    <w:p>
+      <w:pPr>
+        <w:pStyle w:val="FirstParagraph"/>
       </w:pPr>
       <w:r>
         <w:rPr>
           <w:b/>
           <w:bCs/>
         </w:rPr>
+        <w:t xml:space="preserve">Assumption made:</w:t>
+      </w:r>
+      <w:r>
+        <w:t xml:space="preserve"> </w:t>
+      </w:r>
+      <w:r>
+        <w:t xml:space="preserve">Merges exist in the data model (</w:t>
+      </w:r>
+      <w:r>
+        <w:rPr>
+          <w:rStyle w:val="VerbatimChar"/>
+        </w:rPr>
+        <w:t xml:space="preserve">GenealogyRelationshipType</w:t>
+      </w:r>
+      <w:r>
+        <w:t xml:space="preserve"> </w:t>
+      </w:r>
+      <w:r>
+        <w:t xml:space="preserve">has MERGE) but the narrative skipped over them because the FRS explicitly says</w:t>
+      </w:r>
+      <w:r>
+        <w:t xml:space="preserve"> </w:t>
+      </w:r>
+      <w:r>
+        <w:t xml:space="preserve">“business rules TBD.”</w:t>
+      </w:r>
+    </w:p>
+    <w:p>
+      <w:pPr>
+        <w:pStyle w:val="BodyText"/>
+      </w:pPr>
+      <w:r>
+        <w:rPr>
+          <w:b/>
+          <w:bCs/>
+        </w:rPr>
         <w:t xml:space="preserve">Decision (2026-04-09):</w:t>
       </w:r>
       <w:r>
@@ -9578,189 +9528,206 @@
           <w:b/>
           <w:bCs/>
         </w:rPr>
-        <w:t xml:space="preserve">Addendum (2026-04-23, v0.8):</w:t>
-      </w:r>
-      <w:r>
-        <w:t xml:space="preserve"> </w:t>
-      </w:r>
-      <w:r>
-        <w:t xml:space="preserve">Post-merge LOT carries</w:t>
-      </w:r>
-      <w:r>
-        <w:t xml:space="preserve"> </w:t>
-      </w:r>
+        <w:t xml:space="preserve">Decision (2026-04-27 — closed by Jacques, Option A):</w:t>
+      </w:r>
+      <w:r>
+        <w:t xml:space="preserve"> </w:t>
+      </w:r>
+      <w:r>
+        <w:t xml:space="preserve">Hard-coded rules + supervisor override. Rules enforced at the procedure layer: same</w:t>
+      </w:r>
+      <w:r>
+        <w:t xml:space="preserve"> </w:t>
+      </w:r>
+      <w:r>
+        <w:rPr>
+          <w:rStyle w:val="VerbatimChar"/>
+        </w:rPr>
+        <w:t xml:space="preserve">ItemId</w:t>
+      </w:r>
+      <w:r>
+        <w:t xml:space="preserve">, post-sort only (FDS-05-025), die-rank compatibility check via</w:t>
+      </w:r>
+      <w:r>
+        <w:t xml:space="preserve"> </w:t>
+      </w:r>
+      <w:r>
+        <w:rPr>
+          <w:rStyle w:val="VerbatimChar"/>
+        </w:rPr>
+        <w:t xml:space="preserve">Tools.DieRankCompatibility</w:t>
+      </w:r>
+      <w:r>
+        <w:t xml:space="preserve"> </w:t>
+      </w:r>
+      <w:r>
+        <w:t xml:space="preserve">(FDS-05-027), no HOLD × GOOD mixing (FDS-05-026), piece counts additive. Supervisor AD elevation per FDS-04-007 is the override path for edge cases. Awaits S-08 die-rank compatibility matrix from MPP Quality — a seeding item, not a build blocker.</w:t>
+      </w:r>
+    </w:p>
+    <w:p>
+      <w:pPr>
+        <w:pStyle w:val="BodyText"/>
+      </w:pPr>
       <w:r>
         <w:rPr>
           <w:b/>
           <w:bCs/>
         </w:rPr>
-        <w:t xml:space="preserve">NULL</w:t>
+        <w:t xml:space="preserve">Addendum (2026-04-23, v0.8):</w:t>
+      </w:r>
+      <w:r>
+        <w:t xml:space="preserve"> </w:t>
+      </w:r>
+      <w:r>
+        <w:t xml:space="preserve">Post-merge LOT carries</w:t>
+      </w:r>
+      <w:r>
+        <w:t xml:space="preserve"> </w:t>
       </w:r>
       <w:r>
         <w:rPr>
           <w:b/>
           <w:bCs/>
         </w:rPr>
-        <w:t xml:space="preserve"> </w:t>
-      </w:r>
-      <w:r>
-        <w:rPr>
-          <w:rStyle w:val="VerbatimChar"/>
+        <w:t xml:space="preserve">NULL</w:t>
+      </w:r>
+      <w:r>
+        <w:rPr>
           <w:b/>
           <w:bCs/>
         </w:rPr>
-        <w:t xml:space="preserve">ToolId</w:t>
-      </w:r>
-      <w:r>
-        <w:rPr>
+        <w:t xml:space="preserve"> </w:t>
+      </w:r>
+      <w:r>
+        <w:rPr>
+          <w:rStyle w:val="VerbatimChar"/>
           <w:b/>
           <w:bCs/>
         </w:rPr>
-        <w:t xml:space="preserve"> </w:t>
+        <w:t xml:space="preserve">ToolId</w:t>
       </w:r>
       <w:r>
         <w:rPr>
           <w:b/>
           <w:bCs/>
         </w:rPr>
-        <w:t xml:space="preserve">and</w:t>
+        <w:t xml:space="preserve"> </w:t>
       </w:r>
       <w:r>
         <w:rPr>
           <w:b/>
           <w:bCs/>
         </w:rPr>
-        <w:t xml:space="preserve"> </w:t>
-      </w:r>
-      <w:r>
-        <w:rPr>
-          <w:rStyle w:val="VerbatimChar"/>
+        <w:t xml:space="preserve">and</w:t>
+      </w:r>
+      <w:r>
+        <w:rPr>
           <w:b/>
           <w:bCs/>
         </w:rPr>
-        <w:t xml:space="preserve">ToolCavityId</w:t>
-      </w:r>
-      <w:r>
-        <w:t xml:space="preserve"> </w:t>
-      </w:r>
-      <w:r>
-        <w:t xml:space="preserve">— blended-origin material can’t be denormalized into a single FK pair. Tool-specific trace reconstructed via</w:t>
-      </w:r>
-      <w:r>
-        <w:t xml:space="preserve"> </w:t>
-      </w:r>
-      <w:r>
-        <w:rPr>
-          <w:rStyle w:val="VerbatimChar"/>
-        </w:rPr>
-        <w:t xml:space="preserve">LotGenealogy</w:t>
-      </w:r>
-      <w:r>
-        <w:t xml:space="preserve"> </w:t>
-      </w:r>
-      <w:r>
-        <w:t xml:space="preserve">walk of the pre-merge source LOTs (each retains its own Tool/Cavity FKs immutably). See FDS-05-030.</w:t>
-      </w:r>
-    </w:p>
-    <w:bookmarkEnd w:id="173"/>
-    <w:bookmarkStart w:id="174" w:name="Xaf546f60fbb4131369bf8f225358aae274b9155"/>
-    <w:p>
-      <w:pPr>
-        <w:pStyle w:val="Heading3"/>
-      </w:pPr>
-      <w:r>
-        <w:t xml:space="preserve">9. What</w:t>
-      </w:r>
-      <w:r>
-        <w:t xml:space="preserve"> </w:t>
-      </w:r>
-      <w:r>
-        <w:t xml:space="preserve">“Material Verification”</w:t>
-      </w:r>
-      <w:r>
-        <w:t xml:space="preserve"> </w:t>
-      </w:r>
-      <w:r>
-        <w:t xml:space="preserve">Means at Assembly — 🔶 Pending Customer Validation</w:t>
-      </w:r>
-    </w:p>
-    <w:p>
-      <w:pPr>
-        <w:pStyle w:val="FirstParagraph"/>
-      </w:pPr>
-      <w:r>
-        <w:rPr>
+        <w:t xml:space="preserve"> </w:t>
+      </w:r>
+      <w:r>
+        <w:rPr>
+          <w:rStyle w:val="VerbatimChar"/>
           <w:b/>
           <w:bCs/>
         </w:rPr>
-        <w:t xml:space="preserve">Assumption made:</w:t>
-      </w:r>
-      <w:r>
-        <w:t xml:space="preserve"> </w:t>
-      </w:r>
-      <w:r>
-        <w:t xml:space="preserve">The operation template flag</w:t>
-      </w:r>
-      <w:r>
-        <w:t xml:space="preserve"> </w:t>
-      </w:r>
-      <w:r>
-        <w:rPr>
-          <w:rStyle w:val="VerbatimChar"/>
-        </w:rPr>
-        <w:t xml:space="preserve">RequiresMaterialVerification</w:t>
-      </w:r>
-      <w:r>
-        <w:t xml:space="preserve"> </w:t>
-      </w:r>
-      <w:r>
-        <w:t xml:space="preserve">means the operator must scan the source LOT barcode before consuming it, proving the right material is being used.</w:t>
-      </w:r>
-    </w:p>
-    <w:p>
-      <w:pPr>
-        <w:pStyle w:val="BodyText"/>
+        <w:t xml:space="preserve">ToolCavityId</w:t>
+      </w:r>
+      <w:r>
+        <w:t xml:space="preserve"> </w:t>
+      </w:r>
+      <w:r>
+        <w:t xml:space="preserve">— blended-origin material can’t be denormalized into a single FK pair. Tool-specific trace reconstructed via</w:t>
+      </w:r>
+      <w:r>
+        <w:t xml:space="preserve"> </w:t>
+      </w:r>
+      <w:r>
+        <w:rPr>
+          <w:rStyle w:val="VerbatimChar"/>
+        </w:rPr>
+        <w:t xml:space="preserve">LotGenealogy</w:t>
+      </w:r>
+      <w:r>
+        <w:t xml:space="preserve"> </w:t>
+      </w:r>
+      <w:r>
+        <w:t xml:space="preserve">walk of the pre-merge source LOTs (each retains its own Tool/Cavity FKs immutably). See FDS-05-030.</w:t>
+      </w:r>
+    </w:p>
+    <w:bookmarkEnd w:id="173"/>
+    <w:bookmarkStart w:id="174" w:name="X77c422f8ebcf6bcce89a59b2aaf4599da9c3322"/>
+    <w:p>
+      <w:pPr>
+        <w:pStyle w:val="Heading3"/>
+      </w:pPr>
+      <w:r>
+        <w:t xml:space="preserve">9. What</w:t>
+      </w:r>
+      <w:r>
+        <w:t xml:space="preserve"> </w:t>
+      </w:r>
+      <w:r>
+        <w:t xml:space="preserve">“Material Verification”</w:t>
+      </w:r>
+      <w:r>
+        <w:t xml:space="preserve"> </w:t>
+      </w:r>
+      <w:r>
+        <w:t xml:space="preserve">Means at Assembly — ✅ Resolved</w:t>
+      </w:r>
+    </w:p>
+    <w:p>
+      <w:pPr>
+        <w:pStyle w:val="FirstParagraph"/>
       </w:pPr>
       <w:r>
         <w:rPr>
           <w:b/>
           <w:bCs/>
         </w:rPr>
-        <w:t xml:space="preserve">Decision (2026-04-09):</w:t>
-      </w:r>
-      <w:r>
-        <w:t xml:space="preserve"> </w:t>
-      </w:r>
-      <w:r>
-        <w:t xml:space="preserve">BOM-based check. The scanned source LOT’s part number must match a component in the active BOM version. Substitute parts are rejected. Needs MPP confirmation.</w:t>
-      </w:r>
-    </w:p>
-    <w:bookmarkEnd w:id="174"/>
-    <w:bookmarkStart w:id="175" w:name="shift-boundary-handling-open"/>
-    <w:p>
-      <w:pPr>
-        <w:pStyle w:val="Heading3"/>
-      </w:pPr>
-      <w:r>
-        <w:t xml:space="preserve">10. Shift Boundary Handling — ⬜ Open</w:t>
-      </w:r>
-    </w:p>
-    <w:p>
-      <w:pPr>
-        <w:pStyle w:val="FirstParagraph"/>
+        <w:t xml:space="preserve">Assumption made:</w:t>
+      </w:r>
+      <w:r>
+        <w:t xml:space="preserve"> </w:t>
+      </w:r>
+      <w:r>
+        <w:t xml:space="preserve">The operation template flag</w:t>
+      </w:r>
+      <w:r>
+        <w:t xml:space="preserve"> </w:t>
+      </w:r>
+      <w:r>
+        <w:rPr>
+          <w:rStyle w:val="VerbatimChar"/>
+        </w:rPr>
+        <w:t xml:space="preserve">RequiresMaterialVerification</w:t>
+      </w:r>
+      <w:r>
+        <w:t xml:space="preserve"> </w:t>
+      </w:r>
+      <w:r>
+        <w:t xml:space="preserve">means the operator must scan the source LOT barcode before consuming it, proving the right material is being used.</w:t>
+      </w:r>
+    </w:p>
+    <w:p>
+      <w:pPr>
+        <w:pStyle w:val="BodyText"/>
       </w:pPr>
       <w:r>
         <w:rPr>
           <w:b/>
           <w:bCs/>
         </w:rPr>
-        <w:t xml:space="preserve">Assumption made:</w:t>
-      </w:r>
-      <w:r>
-        <w:t xml:space="preserve"> </w:t>
-      </w:r>
-      <w:r>
-        <w:t xml:space="preserve">The narrative cleanly ended a shift and started another. Reality is messier.</w:t>
+        <w:t xml:space="preserve">Decision (2026-04-09):</w:t>
+      </w:r>
+      <w:r>
+        <w:t xml:space="preserve"> </w:t>
+      </w:r>
+      <w:r>
+        <w:t xml:space="preserve">BOM-based check. The scanned source LOT’s part number must match a component in the active BOM version. Substitute parts are rejected. Needs MPP confirmation.</w:t>
       </w:r>
     </w:p>
     <w:p>
@@ -9772,6 +9739,67 @@
           <w:b/>
           <w:bCs/>
         </w:rPr>
+        <w:t xml:space="preserve">Decision (2026-04-27 — closed by Jacques, Option C):</w:t>
+      </w:r>
+      <w:r>
+        <w:t xml:space="preserve"> </w:t>
+      </w:r>
+      <w:r>
+        <w:t xml:space="preserve">Strict BOM check + supervisor override. Wrong-part scans are rejected by default; supervisor AD elevation (FDS-04-007) unlocks a one-shot override that logs the substitution event to</w:t>
+      </w:r>
+      <w:r>
+        <w:t xml:space="preserve"> </w:t>
+      </w:r>
+      <w:r>
+        <w:rPr>
+          <w:rStyle w:val="VerbatimChar"/>
+        </w:rPr>
+        <w:t xml:space="preserve">Audit.OperationLog</w:t>
+      </w:r>
+      <w:r>
+        <w:t xml:space="preserve"> </w:t>
+      </w:r>
+      <w:r>
+        <w:t xml:space="preserve">for full traceability. FDS-06-011 extended with the override flow. No persistent substitute table — permanent substitutes belong in a BOM revision, not a runtime configuration.</w:t>
+      </w:r>
+    </w:p>
+    <w:bookmarkEnd w:id="174"/>
+    <w:bookmarkStart w:id="175" w:name="shift-boundary-handling-resolved"/>
+    <w:p>
+      <w:pPr>
+        <w:pStyle w:val="Heading3"/>
+      </w:pPr>
+      <w:r>
+        <w:t xml:space="preserve">10. Shift Boundary Handling — ✅ Resolved</w:t>
+      </w:r>
+    </w:p>
+    <w:p>
+      <w:pPr>
+        <w:pStyle w:val="FirstParagraph"/>
+      </w:pPr>
+      <w:r>
+        <w:rPr>
+          <w:b/>
+          <w:bCs/>
+        </w:rPr>
+        <w:t xml:space="preserve">Assumption made:</w:t>
+      </w:r>
+      <w:r>
+        <w:t xml:space="preserve"> </w:t>
+      </w:r>
+      <w:r>
+        <w:t xml:space="preserve">The narrative cleanly ended a shift and started another. Reality is messier.</w:t>
+      </w:r>
+    </w:p>
+    <w:p>
+      <w:pPr>
+        <w:pStyle w:val="BodyText"/>
+      </w:pPr>
+      <w:r>
+        <w:rPr>
+          <w:b/>
+          <w:bCs/>
+        </w:rPr>
         <w:t xml:space="preserve">Decision (2026-04-09):</w:t>
       </w:r>
       <w:r>
@@ -9791,43 +9819,61 @@
         <w:t xml:space="preserve">Maps to OI-03.</w:t>
       </w:r>
     </w:p>
-    <w:bookmarkEnd w:id="175"/>
-    <w:bookmarkStart w:id="176" w:name="paper-to-screen-transition-open"/>
-    <w:p>
-      <w:pPr>
-        <w:pStyle w:val="Heading3"/>
-      </w:pPr>
-      <w:r>
-        <w:t xml:space="preserve">11. Paper to Screen Transition — ⬜ Open</w:t>
-      </w:r>
-    </w:p>
-    <w:p>
-      <w:pPr>
-        <w:pStyle w:val="FirstParagraph"/>
+    <w:p>
+      <w:pPr>
+        <w:pStyle w:val="BodyText"/>
       </w:pPr>
       <w:r>
         <w:rPr>
           <w:b/>
           <w:bCs/>
         </w:rPr>
-        <w:t xml:space="preserve">Assumption made:</w:t>
-      </w:r>
-      <w:r>
-        <w:t xml:space="preserve"> </w:t>
-      </w:r>
-      <w:r>
-        <w:t xml:space="preserve">The narrative assumed clean digital workflows where operators enter data in real time at the machine.</w:t>
-      </w:r>
-    </w:p>
-    <w:p>
-      <w:pPr>
-        <w:pStyle w:val="BodyText"/>
+        <w:t xml:space="preserve">Decision (2026-04-27 — closed by Jacques, Option D):</w:t>
+      </w:r>
+      <w:r>
+        <w:t xml:space="preserve"> </w:t>
+      </w:r>
+      <w:r>
+        <w:t xml:space="preserve">Events span naturally (per OI-03) plus an optional shift-end summary screen. Open downtime events, partial containers, and in-progress LOTs persist across the boundary unchanged — no auto-close, no auto-reopen. At shift end the outgoing operator sees a one-screen handover summary of open downtime events, open pause events, and in-process LOTs at their terminal. OEE math slices events by shift window at query time. FDS-09-015 added.</w:t>
+      </w:r>
+    </w:p>
+    <w:bookmarkEnd w:id="175"/>
+    <w:bookmarkStart w:id="176" w:name="paper-to-screen-transition-resolved"/>
+    <w:p>
+      <w:pPr>
+        <w:pStyle w:val="Heading3"/>
+      </w:pPr>
+      <w:r>
+        <w:t xml:space="preserve">11. Paper to Screen Transition — ✅ Resolved</w:t>
+      </w:r>
+    </w:p>
+    <w:p>
+      <w:pPr>
+        <w:pStyle w:val="FirstParagraph"/>
       </w:pPr>
       <w:r>
         <w:rPr>
           <w:b/>
           <w:bCs/>
         </w:rPr>
+        <w:t xml:space="preserve">Assumption made:</w:t>
+      </w:r>
+      <w:r>
+        <w:t xml:space="preserve"> </w:t>
+      </w:r>
+      <w:r>
+        <w:t xml:space="preserve">The narrative assumed clean digital workflows where operators enter data in real time at the machine.</w:t>
+      </w:r>
+    </w:p>
+    <w:p>
+      <w:pPr>
+        <w:pStyle w:val="BodyText"/>
+      </w:pPr>
+      <w:r>
+        <w:rPr>
+          <w:b/>
+          <w:bCs/>
+        </w:rPr>
         <w:t xml:space="preserve">Decision (2026-04-09):</w:t>
       </w:r>
       <w:r>
@@ -9835,6 +9881,24 @@
       </w:r>
       <w:r>
         <w:t xml:space="preserve">Flagged for discussion with Ben. Whether Perspective screens replace paper at point-of-action or some stations retain paper-first workflow is a process change that requires MPP commitment.</w:t>
+      </w:r>
+    </w:p>
+    <w:p>
+      <w:pPr>
+        <w:pStyle w:val="BodyText"/>
+      </w:pPr>
+      <w:r>
+        <w:rPr>
+          <w:b/>
+          <w:bCs/>
+        </w:rPr>
+        <w:t xml:space="preserve">Decision (2026-04-27 — closed by Jacques, Option A — flagged risk):</w:t>
+      </w:r>
+      <w:r>
+        <w:t xml:space="preserve"> </w:t>
+      </w:r>
+      <w:r>
+        <w:t xml:space="preserve">All-at-once cutover. Every station goes digital on go-live day; paper sheets become invalid. Risk: requires every terminal in place before flip and carries the highest training and operations burden. Risk owner: Ben (OI-31 rollout shape). Couples to UJ-19 (Productivity DB transition).</w:t>
       </w:r>
     </w:p>
     <w:bookmarkEnd w:id="176"/>
@@ -10511,13 +10575,13 @@
       </w:r>
     </w:p>
     <w:bookmarkEnd w:id="181"/>
-    <w:bookmarkStart w:id="182" w:name="X7711411ed0c744b11ef8373c23e3eb986c2f7d7"/>
+    <w:bookmarkStart w:id="182" w:name="X47eabfda83b303913bff293420edd222afb67fd"/>
     <w:p>
       <w:pPr>
         <w:pStyle w:val="Heading3"/>
       </w:pPr>
       <w:r>
-        <w:t xml:space="preserve">17. Vision System vs. Barcode Confirmation — 🔶 Pending Internal Review</w:t>
+        <w:t xml:space="preserve">17. Vision System vs. Barcode Confirmation — ✅ Resolved</w:t>
       </w:r>
     </w:p>
     <w:p>
@@ -10568,7 +10632,7 @@
         <w:t xml:space="preserve"> </w:t>
       </w:r>
       <w:r>
-        <w:t xml:space="preserve">Vision conflict resolution: auto-hold LOT + supervisor override popup (per OI-04). Flagged for discussion with Ben.</w:t>
+        <w:t xml:space="preserve">Flagged for discussion with Ben.</w:t>
       </w:r>
       <w:r>
         <w:t xml:space="preserve"> </w:t>
@@ -10579,6 +10643,69 @@
           <w:iCs/>
         </w:rPr>
         <w:t xml:space="preserve">Maps to OI-04.</w:t>
+      </w:r>
+    </w:p>
+    <w:p>
+      <w:pPr>
+        <w:pStyle w:val="BodyText"/>
+      </w:pPr>
+      <w:r>
+        <w:rPr>
+          <w:b/>
+          <w:bCs/>
+        </w:rPr>
+        <w:t xml:space="preserve">Decision (2026-04-27 — closed by Jacques, Option A):</w:t>
+      </w:r>
+      <w:r>
+        <w:t xml:space="preserve"> </w:t>
+      </w:r>
+      <w:r>
+        <w:t xml:space="preserve">Single configured source per Cell via a</w:t>
+      </w:r>
+      <w:r>
+        <w:t xml:space="preserve"> </w:t>
+      </w:r>
+      <w:r>
+        <w:rPr>
+          <w:rStyle w:val="VerbatimChar"/>
+        </w:rPr>
+        <w:t xml:space="preserve">ConfirmationMethod</w:t>
+      </w:r>
+      <w:r>
+        <w:t xml:space="preserve"> </w:t>
+      </w:r>
+      <w:r>
+        <w:t xml:space="preserve">LocationAttribute (</w:t>
+      </w:r>
+      <w:r>
+        <w:t xml:space="preserve">‘Vision’</w:t>
+      </w:r>
+      <w:r>
+        <w:t xml:space="preserve"> </w:t>
+      </w:r>
+      <w:r>
+        <w:t xml:space="preserve">/</w:t>
+      </w:r>
+      <w:r>
+        <w:t xml:space="preserve"> </w:t>
+      </w:r>
+      <w:r>
+        <w:t xml:space="preserve">‘Barcode’</w:t>
+      </w:r>
+      <w:r>
+        <w:t xml:space="preserve"> </w:t>
+      </w:r>
+      <w:r>
+        <w:t xml:space="preserve">/</w:t>
+      </w:r>
+      <w:r>
+        <w:t xml:space="preserve"> </w:t>
+      </w:r>
+      <w:r>
+        <w:t xml:space="preserve">‘Both’</w:t>
+      </w:r>
+      <w:r>
+        <w:t xml:space="preserve">). Each line’s confirmation source is configured once at deployment; the MES validates against whatever source(s) are configured. Edge-case mismatches (e.g., barcode unreadable but vision OK) surface as 10-fail line stops per OI-04 — not auto-hold on the LOT. FDS-10-013 added.</w:t>
       </w:r>
     </w:p>
     <w:bookmarkEnd w:id="182"/>

</xml_diff>

<commit_message>
docs: relocate sub-LOT split from Trim OUT to Machining OUT (FDS v1.3 / Phased Plan v1.1)
RequiresSubLotSplit on Parts.OperationTemplate now governs the Machining
OUT outbound flow (FDS-05-009); Trim OUT becomes a 1:1 whole-LOT move.
ALTER moves from Phase 4 migration 0017 to Phase 5 migration 0018.

- DATA_MODEL: rev 2026-06-04n, RequiresSubLotSplit semantics reworded
- FDS: v1.3 crosswalk updates
- PHASED_PLAN_PLANT_FLOOR: v1.1, Trim OUT/Machining OUT flow rewrite
- USER_JOURNEYS: matching narrative updates
- regenerated .docx for all four
</commit_message>
<xml_diff>
--- a/MPP_MES_USER_JOURNEYS.docx
+++ b/MPP_MES_USER_JOURNEYS.docx
@@ -1968,6 +1968,182 @@
             </w:r>
             <w:r>
               <w:t xml:space="preserve">.</w:t>
+            </w:r>
+          </w:p>
+        </w:tc>
+      </w:tr>
+      <w:tr>
+        <w:tc>
+          <w:tcPr/>
+          <w:p>
+            <w:pPr>
+              <w:pStyle w:val="Compact"/>
+            </w:pPr>
+            <w:r>
+              <w:t xml:space="preserve">0.9-rev3</w:t>
+            </w:r>
+          </w:p>
+        </w:tc>
+        <w:tc>
+          <w:tcPr/>
+          <w:p>
+            <w:pPr>
+              <w:pStyle w:val="Compact"/>
+            </w:pPr>
+            <w:r>
+              <w:t xml:space="preserve">2026-06-04</w:t>
+            </w:r>
+          </w:p>
+        </w:tc>
+        <w:tc>
+          <w:tcPr/>
+          <w:p>
+            <w:pPr>
+              <w:pStyle w:val="Compact"/>
+            </w:pPr>
+            <w:r>
+              <w:t xml:space="preserve">Blue Ridge Automation</w:t>
+            </w:r>
+          </w:p>
+        </w:tc>
+        <w:tc>
+          <w:tcPr/>
+          <w:p>
+            <w:pPr>
+              <w:pStyle w:val="Compact"/>
+            </w:pPr>
+            <w:r>
+              <w:rPr>
+                <w:b/>
+                <w:bCs/>
+              </w:rPr>
+              <w:t xml:space="preserve">Sub-LOT split reverted Trim OUT → Machining OUT (per MPP, confirmed 2026-06); customer-dependent container completion captured.</w:t>
+            </w:r>
+            <w:r>
+              <w:t xml:space="preserve"> </w:t>
+            </w:r>
+            <w:r>
+              <w:t xml:space="preserve">Plant Floor arc: 8:30am Trim OUT scene rewritten as a 1:1 whole-LOT move (no split); 10:00am Machining IN now picks whole cast/trim LOTs; Machining OUT rewritten with three paths — Path A sub-LOT split (sublotting lines,</w:t>
+            </w:r>
+            <w:r>
+              <w:t xml:space="preserve"> </w:t>
+            </w:r>
+            <w:r>
+              <w:rPr>
+                <w:rStyle w:val="VerbatimChar"/>
+              </w:rPr>
+              <w:t xml:space="preserve">RequiresSubLotSplit=1</w:t>
+            </w:r>
+            <w:r>
+              <w:t xml:space="preserve">), Path B PLC auto-move (coupled), Path C operator move (uncoupled). The Sub-LOT Distribution screenshot relocated from Trim to Machining OUT. Three mockup screenshots (Trim Check-OUT, Machining IN queue, Sub-LOT Distribution) flagged</w:t>
+            </w:r>
+            <w:r>
+              <w:t xml:space="preserve"> </w:t>
+            </w:r>
+            <w:r>
+              <w:rPr>
+                <w:b/>
+                <w:bCs/>
+              </w:rPr>
+              <w:t xml:space="preserve">pending re-capture</w:t>
+            </w:r>
+            <w:r>
+              <w:t xml:space="preserve"> </w:t>
+            </w:r>
+            <w:r>
+              <w:t xml:space="preserve">— they predate the relocation and still show the Trim-OUT-split UX. §3 (UJ-03) decision superseded — split is at Machining OUT (the original 2026-04-09 machining-initiated assumption was right). §4 + §13:</w:t>
+            </w:r>
+            <w:r>
+              <w:t xml:space="preserve"> </w:t>
+            </w:r>
+            <w:r>
+              <w:rPr>
+                <w:rStyle w:val="VerbatimChar"/>
+              </w:rPr>
+              <w:t xml:space="preserve">ClosureMethod</w:t>
+            </w:r>
+            <w:r>
+              <w:t xml:space="preserve"> </w:t>
+            </w:r>
+            <w:r>
+              <w:t xml:space="preserve">annotated</w:t>
+            </w:r>
+            <w:r>
+              <w:t xml:space="preserve"> </w:t>
+            </w:r>
+            <w:r>
+              <w:rPr>
+                <w:b/>
+                <w:bCs/>
+              </w:rPr>
+              <w:t xml:space="preserve">per-Item / per-customer</w:t>
+            </w:r>
+            <w:r>
+              <w:t xml:space="preserve"> </w:t>
+            </w:r>
+            <w:r>
+              <w:t xml:space="preserve">(one line runs both</w:t>
+            </w:r>
+            <w:r>
+              <w:t xml:space="preserve"> </w:t>
+            </w:r>
+            <w:r>
+              <w:rPr>
+                <w:rStyle w:val="VerbatimChar"/>
+              </w:rPr>
+              <w:t xml:space="preserve">ByCount</w:t>
+            </w:r>
+            <w:r>
+              <w:t xml:space="preserve"> </w:t>
+            </w:r>
+            <w:r>
+              <w:t xml:space="preserve">and</w:t>
+            </w:r>
+            <w:r>
+              <w:t xml:space="preserve"> </w:t>
+            </w:r>
+            <w:r>
+              <w:rPr>
+                <w:rStyle w:val="VerbatimChar"/>
+              </w:rPr>
+              <w:t xml:space="preserve">ByVision</w:t>
+            </w:r>
+            <w:r>
+              <w:t xml:space="preserve"> </w:t>
+            </w:r>
+            <w:r>
+              <w:t xml:space="preserve">parts for different customers); capability binding is</w:t>
+            </w:r>
+            <w:r>
+              <w:t xml:space="preserve"> </w:t>
+            </w:r>
+            <w:r>
+              <w:rPr>
+                <w:b/>
+                <w:bCs/>
+              </w:rPr>
+              <w:t xml:space="preserve">routing-trusted, not proc-enforced</w:t>
+            </w:r>
+            <w:r>
+              <w:t xml:space="preserve"> </w:t>
+            </w:r>
+            <w:r>
+              <w:t xml:space="preserve">(2026-06-04);</w:t>
+            </w:r>
+            <w:r>
+              <w:t xml:space="preserve"> </w:t>
+            </w:r>
+            <w:r>
+              <w:rPr>
+                <w:rStyle w:val="VerbatimChar"/>
+              </w:rPr>
+              <w:t xml:space="preserve">ByVision</w:t>
+            </w:r>
+            <w:r>
+              <w:t xml:space="preserve"> </w:t>
+            </w:r>
+            <w:r>
+              <w:t xml:space="preserve">wording corrected to tray-level (one event per tray, not per piece) per FDS-06-014. Mirrors FDS v1.3 / Data Model v1.9n / Phased Plan v1.1.</w:t>
             </w:r>
           </w:p>
         </w:tc>
@@ -5266,7 +5442,7 @@
       </w:r>
     </w:p>
     <w:bookmarkEnd w:id="96"/>
-    <w:bookmarkStart w:id="112" w:name="am-trim-shop-lot-moves-through-the-plant"/>
+    <w:bookmarkStart w:id="109" w:name="am-trim-shop-lot-moves-through-the-plant"/>
     <w:p>
       <w:pPr>
         <w:pStyle w:val="Heading3"/>
@@ -5683,7 +5859,7 @@
           <wp:inline>
             <wp:extent cx="5334000" cy="2640594"/>
             <wp:effectExtent b="0" l="0" r="0" t="0"/>
-            <wp:docPr descr="Trim Station — Check OUT, RequiresSubLotSplit ON" title="" id="104" name="Picture"/>
+            <wp:docPr descr="Trim Station — Check OUT" title="" id="104" name="Picture"/>
             <a:graphic>
               <a:graphicData uri="http://schemas.openxmlformats.org/drawingml/2006/picture">
                 <pic:pic>
@@ -5726,7 +5902,7 @@
         <w:pStyle w:val="ImageCaption"/>
       </w:pPr>
       <w:r>
-        <w:t xml:space="preserve">Trim Station — Check OUT, RequiresSubLotSplit ON</w:t>
+        <w:t xml:space="preserve">Trim Station — Check OUT</w:t>
       </w:r>
     </w:p>
     <w:p>
@@ -5738,49 +5914,117 @@
           <w:i/>
           <w:iCs/>
         </w:rPr>
-        <w:t xml:space="preserve">Check OUT state: OperationTemplate banner (TrimOut · 5G0-TRIM-4102 v3) with RequiresSubLotSplit = ON · split + route shown at right. Closing ProductionEvent (TrimOut) section captures Operator Initials. Reject Entry · Trim Yield Loss section below records RejectEvents against the LOT with Trim-area Defect Code and Quantity.</w:t>
-      </w:r>
-    </w:p>
-    <w:p>
-      <w:pPr>
-        <w:pStyle w:val="BodyText"/>
-      </w:pPr>
+        <w:t xml:space="preserve">Check OUT state: OperationTemplate banner (TrimOut · 5G0-TRIM-4102 v3). Closing ProductionEvent (TrimOut) section captures Operator Initials. Reject Entry · Trim Yield Loss section below records RejectEvents against the LOT with Trim-area Defect Code and Quantity.</w:t>
+      </w:r>
+      <w:r>
+        <w:rPr>
+          <w:i/>
+          <w:iCs/>
+        </w:rPr>
+        <w:t xml:space="preserve"> </w:t>
+      </w:r>
       <w:r>
         <w:rPr>
           <w:b/>
           <w:bCs/>
-        </w:rPr>
-        <w:t xml:space="preserve">Trim OUT — sub-LOT split + route to Machining FIFO (FDS-05-009).</w:t>
-      </w:r>
-      <w:r>
-        <w:t xml:space="preserve"> </w:t>
-      </w:r>
-      <w:r>
-        <w:t xml:space="preserve">When the Trim operator finishes their work on the LOT, they trigger Trim OUT. The MES presents a</w:t>
-      </w:r>
-      <w:r>
-        <w:t xml:space="preserve"> </w:t>
+          <w:i/>
+          <w:iCs/>
+        </w:rPr>
+        <w:t xml:space="preserve">(Screenshot predates the 2026-06 Machining-OUT relocation — it still shows the retired</w:t>
       </w:r>
       <w:r>
         <w:rPr>
           <w:b/>
           <w:bCs/>
-        </w:rPr>
-        <w:t xml:space="preserve">sub-LOT split confirmation dialog</w:t>
-      </w:r>
-      <w:r>
-        <w:t xml:space="preserve"> </w:t>
-      </w:r>
-      <w:r>
-        <w:t xml:space="preserve">— the parent LOT splits N ways across N destination Machining Cells (default N=2, evenly split — e.g., 50 → 25/25). The operator MAY adjust the number of sublots and the per-sublot quantities; the total SHALL equal the parent’s piece count. For each sub-LOT, the operator selects the destination Machining Cell either by</w:t>
-      </w:r>
-      <w:r>
+          <w:i/>
+          <w:iCs/>
+        </w:rPr>
         <w:t xml:space="preserve"> </w:t>
       </w:r>
       <w:r>
         <w:rPr>
           <w:b/>
           <w:bCs/>
+          <w:i/>
+          <w:iCs/>
+        </w:rPr>
+        <w:t xml:space="preserve">“RequiresSubLotSplit · split + route”</w:t>
+      </w:r>
+      <w:r>
+        <w:rPr>
+          <w:b/>
+          <w:bCs/>
+          <w:i/>
+          <w:iCs/>
+        </w:rPr>
+        <w:t xml:space="preserve"> </w:t>
+      </w:r>
+      <w:r>
+        <w:rPr>
+          <w:b/>
+          <w:bCs/>
+          <w:i/>
+          <w:iCs/>
+        </w:rPr>
+        <w:t xml:space="preserve">toggle at Trim; Trim OUT is now a whole-LOT move. Pending re-capture.)</w:t>
+      </w:r>
+    </w:p>
+    <w:p>
+      <w:pPr>
+        <w:pStyle w:val="BodyText"/>
+      </w:pPr>
+      <w:r>
+        <w:rPr>
+          <w:b/>
+          <w:bCs/>
+        </w:rPr>
+        <w:t xml:space="preserve">Trim OUT — 1:1 whole-LOT move to Machining (FDS-06-006).</w:t>
+      </w:r>
+      <w:r>
+        <w:t xml:space="preserve"> </w:t>
+      </w:r>
+      <w:r>
+        <w:t xml:space="preserve">When the Trim operator finishes their work on the LOT, they trigger Trim OUT. Trim OUT does</w:t>
+      </w:r>
+      <w:r>
+        <w:t xml:space="preserve"> </w:t>
+      </w:r>
+      <w:r>
+        <w:rPr>
+          <w:b/>
+          <w:bCs/>
+        </w:rPr>
+        <w:t xml:space="preserve">not</w:t>
+      </w:r>
+      <w:r>
+        <w:t xml:space="preserve"> </w:t>
+      </w:r>
+      <w:r>
+        <w:t xml:space="preserve">split — the LOT moves</w:t>
+      </w:r>
+      <w:r>
+        <w:t xml:space="preserve"> </w:t>
+      </w:r>
+      <w:r>
+        <w:rPr>
+          <w:b/>
+          <w:bCs/>
+        </w:rPr>
+        <w:t xml:space="preserve">whole</w:t>
+      </w:r>
+      <w:r>
+        <w:t xml:space="preserve"> </w:t>
+      </w:r>
+      <w:r>
+        <w:t xml:space="preserve">to its destination Machining line. The operator selects the destination by</w:t>
+      </w:r>
+      <w:r>
+        <w:t xml:space="preserve"> </w:t>
+      </w:r>
+      <w:r>
+        <w:rPr>
+          <w:b/>
+          <w:bCs/>
         </w:rPr>
         <w:t xml:space="preserve">scan or dropdown</w:t>
       </w:r>
@@ -5788,7 +6032,37 @@
         <w:t xml:space="preserve"> </w:t>
       </w:r>
       <w:r>
-        <w:t xml:space="preserve">(FDS-02-009) — that selection writes the sub-LOT into the chosen Cell’s FIFO queue. On confirm: N child LOTs are created (each inheriting the parent’s</w:t>
+        <w:t xml:space="preserve">(FDS-02-009), or routing supplies it where the Operation Template defines it. On confirm: a closing</w:t>
+      </w:r>
+      <w:r>
+        <w:t xml:space="preserve"> </w:t>
+      </w:r>
+      <w:r>
+        <w:rPr>
+          <w:rStyle w:val="VerbatimChar"/>
+        </w:rPr>
+        <w:t xml:space="preserve">ProductionEvent</w:t>
+      </w:r>
+      <w:r>
+        <w:t xml:space="preserve"> </w:t>
+      </w:r>
+      <w:r>
+        <w:t xml:space="preserve">(TrimOut) is written; a</w:t>
+      </w:r>
+      <w:r>
+        <w:t xml:space="preserve"> </w:t>
+      </w:r>
+      <w:r>
+        <w:rPr>
+          <w:rStyle w:val="VerbatimChar"/>
+        </w:rPr>
+        <w:t xml:space="preserve">LotMovement</w:t>
+      </w:r>
+      <w:r>
+        <w:t xml:space="preserve"> </w:t>
+      </w:r>
+      <w:r>
+        <w:t xml:space="preserve">records the whole LOT moving from the Trim Shop Area to the destination, where it lands in that line’s FIFO queue (read at Machining IN); the LOT keeps its</w:t>
       </w:r>
       <w:r>
         <w:t xml:space="preserve"> </w:t>
@@ -5803,52 +6077,23 @@
         <w:t xml:space="preserve"> </w:t>
       </w:r>
       <w:r>
-        <w:t xml:space="preserve">Item — the rename hasn’t happened yet);</w:t>
-      </w:r>
-      <w:r>
-        <w:t xml:space="preserve"> </w:t>
-      </w:r>
-      <w:r>
-        <w:rPr>
-          <w:rStyle w:val="VerbatimChar"/>
-        </w:rPr>
-        <w:t xml:space="preserve">LotGenealogy</w:t>
-      </w:r>
-      <w:r>
-        <w:t xml:space="preserve"> </w:t>
-      </w:r>
-      <w:r>
-        <w:t xml:space="preserve">records the parent→child Split links;</w:t>
-      </w:r>
-      <w:r>
-        <w:t xml:space="preserve"> </w:t>
-      </w:r>
-      <w:r>
-        <w:rPr>
-          <w:rStyle w:val="VerbatimChar"/>
-        </w:rPr>
-        <w:t xml:space="preserve">LotMovement</w:t>
-      </w:r>
-      <w:r>
-        <w:t xml:space="preserve"> </w:t>
-      </w:r>
-      <w:r>
-        <w:t xml:space="preserve">rows record each sub-LOT moving from the Trim Cell to its destination Machining Cell; the parent LOT closes when all pieces have been distributed; LTT labels print for the children showing both the child and parent</w:t>
-      </w:r>
-      <w:r>
-        <w:t xml:space="preserve"> </w:t>
-      </w:r>
-      <w:r>
-        <w:rPr>
-          <w:rStyle w:val="VerbatimChar"/>
-        </w:rPr>
-        <w:t xml:space="preserve">LotName</w:t>
-      </w:r>
-      <w:r>
-        <w:t xml:space="preserve"> </w:t>
-      </w:r>
-      <w:r>
-        <w:t xml:space="preserve">(FDS-05-024).</w:t>
+        <w:t xml:space="preserve">identity (the rename fires at Machining IN) and stays open — nothing is split off. Sub-LOT splitting, when a line does it, happens later at</w:t>
+      </w:r>
+      <w:r>
+        <w:t xml:space="preserve"> </w:t>
+      </w:r>
+      <w:r>
+        <w:rPr>
+          <w:b/>
+          <w:bCs/>
+        </w:rPr>
+        <w:t xml:space="preserve">Machining OUT</w:t>
+      </w:r>
+      <w:r>
+        <w:t xml:space="preserve"> </w:t>
+      </w:r>
+      <w:r>
+        <w:t xml:space="preserve">(see the 10:00am scene).</w:t>
       </w:r>
     </w:p>
     <w:p>
@@ -5858,20 +6103,676 @@
       <w:r>
         <w:drawing>
           <wp:inline>
-            <wp:extent cx="5334000" cy="1126940"/>
+            <wp:extent cx="5334000" cy="2629397"/>
             <wp:effectExtent b="0" l="0" r="0" t="0"/>
-            <wp:docPr descr="Sub-LOT Distribution — 2 destinations, 48 pcs split 24/24" title="" id="107" name="Picture"/>
+            <wp:docPr descr="Trim Station — Error state, LOT not at this Cell" title="" id="107" name="Picture"/>
             <a:graphic>
               <a:graphicData uri="http://schemas.openxmlformats.org/drawingml/2006/picture">
                 <pic:pic>
                   <pic:nvPicPr>
-                    <pic:cNvPr descr="mockup_screenshots/Screenshot%202026-04-30%20124742.png" id="108" name="Picture"/>
+                    <pic:cNvPr descr="mockup_screenshots/Screenshot%202026-04-30%20124755.png" id="108" name="Picture"/>
                     <pic:cNvPicPr>
                       <a:picLocks noChangeArrowheads="1" noChangeAspect="1"/>
                     </pic:cNvPicPr>
                   </pic:nvPicPr>
                   <pic:blipFill>
                     <a:blip r:embed="rId106"/>
+                    <a:stretch>
+                      <a:fillRect/>
+                    </a:stretch>
+                  </pic:blipFill>
+                  <pic:spPr bwMode="auto">
+                    <a:xfrm>
+                      <a:off x="0" y="0"/>
+                      <a:ext cx="5334000" cy="2629397"/>
+                    </a:xfrm>
+                    <a:prstGeom prst="rect">
+                      <a:avLst/>
+                    </a:prstGeom>
+                    <a:noFill/>
+                    <a:ln w="9525">
+                      <a:noFill/>
+                      <a:headEnd/>
+                      <a:tailEnd/>
+                    </a:ln>
+                  </pic:spPr>
+                </pic:pic>
+              </a:graphicData>
+            </a:graphic>
+          </wp:inline>
+        </w:drawing>
+      </w:r>
+    </w:p>
+    <w:p>
+      <w:pPr>
+        <w:pStyle w:val="ImageCaption"/>
+      </w:pPr>
+      <w:r>
+        <w:t xml:space="preserve">Trim Station — Error state, LOT not at this Cell</w:t>
+      </w:r>
+    </w:p>
+    <w:p>
+      <w:pPr>
+        <w:pStyle w:val="BodyText"/>
+      </w:pPr>
+      <w:r>
+        <w:rPr>
+          <w:i/>
+          <w:iCs/>
+        </w:rPr>
+        <w:t xml:space="preserve">Error state: scanned LOT is not in storage and is not currently active here. The CAN’T PROCESS THIS LOT HERE panel shows the scanned LotName, its current location (already past Trim), and who checked it in. Operator returns the basket to the storage queue; LOT Detail lookup is a supervisor / elevated action.</w:t>
+      </w:r>
+    </w:p>
+    <w:bookmarkEnd w:id="109"/>
+    <w:bookmarkStart w:id="119" w:name="X33b4f3c9a0224f726c67dbc69ec4a6e4d562a08"/>
+    <w:p>
+      <w:pPr>
+        <w:pStyle w:val="Heading3"/>
+      </w:pPr>
+      <w:r>
+        <w:t xml:space="preserve">10:00am — Machining: Picking from FIFO + Identity Rename</w:t>
+      </w:r>
+    </w:p>
+    <w:p>
+      <w:pPr>
+        <w:pStyle w:val="FirstParagraph"/>
+      </w:pPr>
+      <w:r>
+        <w:t xml:space="preserve">The whole LOTs that were moved at Trim OUT are now sitting in the destination Machining line’s FIFO queue, waiting. At CNC machine 12, the machining operator (a different operator, not Carlos) walks up to the Cell’s terminal. The screen surfaces the</w:t>
+      </w:r>
+      <w:r>
+        <w:t xml:space="preserve"> </w:t>
+      </w:r>
+      <w:r>
+        <w:rPr>
+          <w:b/>
+          <w:bCs/>
+        </w:rPr>
+        <w:t xml:space="preserve">Machining IN</w:t>
+      </w:r>
+      <w:r>
+        <w:t xml:space="preserve"> </w:t>
+      </w:r>
+      <w:r>
+        <w:t xml:space="preserve">view — there’s no LTT scan-to-receive at this step. The terminal shows the FIFO queue for this Cell with each LOT’s</w:t>
+      </w:r>
+      <w:r>
+        <w:t xml:space="preserve"> </w:t>
+      </w:r>
+      <w:r>
+        <w:rPr>
+          <w:rStyle w:val="VerbatimChar"/>
+        </w:rPr>
+        <w:t xml:space="preserve">LotName</w:t>
+      </w:r>
+      <w:r>
+        <w:t xml:space="preserve">, piece count, and arrival time. The operator picks the next one in line (or overrides the order if production needs require it, per FRS 2.2.4).</w:t>
+      </w:r>
+    </w:p>
+    <w:p>
+      <w:pPr>
+        <w:pStyle w:val="CaptionedFigure"/>
+      </w:pPr>
+      <w:r>
+        <w:drawing>
+          <wp:inline>
+            <wp:extent cx="5334000" cy="2640538"/>
+            <wp:effectExtent b="0" l="0" r="0" t="0"/>
+            <wp:docPr descr="Machining IN — FIFO queue, LOTs awaiting" title="" id="111" name="Picture"/>
+            <a:graphic>
+              <a:graphicData uri="http://schemas.openxmlformats.org/drawingml/2006/picture">
+                <pic:pic>
+                  <pic:nvPicPr>
+                    <pic:cNvPr descr="mockup_screenshots/Screenshot%202026-04-30%20124828.png" id="112" name="Picture"/>
+                    <pic:cNvPicPr>
+                      <a:picLocks noChangeArrowheads="1" noChangeAspect="1"/>
+                    </pic:cNvPicPr>
+                  </pic:nvPicPr>
+                  <pic:blipFill>
+                    <a:blip r:embed="rId110"/>
+                    <a:stretch>
+                      <a:fillRect/>
+                    </a:stretch>
+                  </pic:blipFill>
+                  <pic:spPr bwMode="auto">
+                    <a:xfrm>
+                      <a:off x="0" y="0"/>
+                      <a:ext cx="5334000" cy="2640538"/>
+                    </a:xfrm>
+                    <a:prstGeom prst="rect">
+                      <a:avLst/>
+                    </a:prstGeom>
+                    <a:noFill/>
+                    <a:ln w="9525">
+                      <a:noFill/>
+                      <a:headEnd/>
+                      <a:tailEnd/>
+                    </a:ln>
+                  </pic:spPr>
+                </pic:pic>
+              </a:graphicData>
+            </a:graphic>
+          </wp:inline>
+        </w:drawing>
+      </w:r>
+    </w:p>
+    <w:p>
+      <w:pPr>
+        <w:pStyle w:val="ImageCaption"/>
+      </w:pPr>
+      <w:r>
+        <w:t xml:space="preserve">Machining IN — FIFO queue, LOTs awaiting</w:t>
+      </w:r>
+    </w:p>
+    <w:p>
+      <w:pPr>
+        <w:pStyle w:val="BodyText"/>
+      </w:pPr>
+      <w:r>
+        <w:rPr>
+          <w:i/>
+          <w:iCs/>
+        </w:rPr>
+        <w:t xml:space="preserve">Machining IN screen: no scan-to-receive. FIFO Queue panel lists LOTs in arrival order with Position, LotName, Item, piece count, and arrival time. GOOD badge allows pick; HOLD badge blocks it. Pick (skip queue) is available on non-oldest positions. Active Machined LOT section below fills after a pick confirms.</w:t>
+      </w:r>
+      <w:r>
+        <w:rPr>
+          <w:i/>
+          <w:iCs/>
+        </w:rPr>
+        <w:t xml:space="preserve"> </w:t>
+      </w:r>
+      <w:r>
+        <w:rPr>
+          <w:b/>
+          <w:bCs/>
+          <w:i/>
+          <w:iCs/>
+        </w:rPr>
+        <w:t xml:space="preserve">(Screenshot predates the 2026-06 relocation — it labels the queue entries</w:t>
+      </w:r>
+      <w:r>
+        <w:rPr>
+          <w:b/>
+          <w:bCs/>
+          <w:i/>
+          <w:iCs/>
+        </w:rPr>
+        <w:t xml:space="preserve"> </w:t>
+      </w:r>
+      <w:r>
+        <w:rPr>
+          <w:b/>
+          <w:bCs/>
+          <w:i/>
+          <w:iCs/>
+        </w:rPr>
+        <w:t xml:space="preserve">“sub-LOTs”</w:t>
+      </w:r>
+      <w:r>
+        <w:rPr>
+          <w:b/>
+          <w:bCs/>
+          <w:i/>
+          <w:iCs/>
+        </w:rPr>
+        <w:t xml:space="preserve">; they are now whole cast/trim LOTs, since the split moved to Machining OUT. Pending re-capture.)</w:t>
+      </w:r>
+    </w:p>
+    <w:p>
+      <w:pPr>
+        <w:pStyle w:val="BodyText"/>
+      </w:pPr>
+      <w:r>
+        <w:t xml:space="preserve">On pick, the MES applies the</w:t>
+      </w:r>
+      <w:r>
+        <w:t xml:space="preserve"> </w:t>
+      </w:r>
+      <w:r>
+        <w:rPr>
+          <w:b/>
+          <w:bCs/>
+        </w:rPr>
+        <w:t xml:space="preserve">BOM-driven part-identity rename</w:t>
+      </w:r>
+      <w:r>
+        <w:t xml:space="preserve">. The picked LOT carries Item</w:t>
+      </w:r>
+      <w:r>
+        <w:t xml:space="preserve"> </w:t>
+      </w:r>
+      <w:r>
+        <w:rPr>
+          <w:rStyle w:val="VerbatimChar"/>
+        </w:rPr>
+        <w:t xml:space="preserve">5G0-TRIM-4102</w:t>
+      </w:r>
+      <w:r>
+        <w:t xml:space="preserve">; the active</w:t>
+      </w:r>
+      <w:r>
+        <w:t xml:space="preserve"> </w:t>
+      </w:r>
+      <w:r>
+        <w:rPr>
+          <w:rStyle w:val="VerbatimChar"/>
+        </w:rPr>
+        <w:t xml:space="preserve">Parts.Bom</w:t>
+      </w:r>
+      <w:r>
+        <w:t xml:space="preserve"> </w:t>
+      </w:r>
+      <w:r>
+        <w:t xml:space="preserve">for</w:t>
+      </w:r>
+      <w:r>
+        <w:t xml:space="preserve"> </w:t>
+      </w:r>
+      <w:r>
+        <w:rPr>
+          <w:rStyle w:val="VerbatimChar"/>
+        </w:rPr>
+        <w:t xml:space="preserve">5G0-MACHINED-4102</w:t>
+      </w:r>
+      <w:r>
+        <w:t xml:space="preserve"> </w:t>
+      </w:r>
+      <w:r>
+        <w:t xml:space="preserve">has a single</w:t>
+      </w:r>
+      <w:r>
+        <w:t xml:space="preserve"> </w:t>
+      </w:r>
+      <w:r>
+        <w:rPr>
+          <w:rStyle w:val="VerbatimChar"/>
+        </w:rPr>
+        <w:t xml:space="preserve">BomLine</w:t>
+      </w:r>
+      <w:r>
+        <w:t xml:space="preserve"> </w:t>
+      </w:r>
+      <w:r>
+        <w:t xml:space="preserve">with</w:t>
+      </w:r>
+      <w:r>
+        <w:t xml:space="preserve"> </w:t>
+      </w:r>
+      <w:r>
+        <w:rPr>
+          <w:rStyle w:val="VerbatimChar"/>
+        </w:rPr>
+        <w:t xml:space="preserve">ChildItemId = 5G0-TRIM-4102</w:t>
+      </w:r>
+      <w:r>
+        <w:t xml:space="preserve"> </w:t>
+      </w:r>
+      <w:r>
+        <w:t xml:space="preserve">at QtyPer=1. The MES prompts:</w:t>
+      </w:r>
+      <w:r>
+        <w:t xml:space="preserve"> </w:t>
+      </w:r>
+      <w:r>
+        <w:rPr>
+          <w:i/>
+          <w:iCs/>
+        </w:rPr>
+        <w:t xml:space="preserve">“This LOT is 5G0-TRIM-4102. Receive as 5G0-MACHINED-4102?”</w:t>
+      </w:r>
+      <w:r>
+        <w:t xml:space="preserve"> </w:t>
+      </w:r>
+      <w:r>
+        <w:t xml:space="preserve">The operator confirms. A new destination LOT is created under the machined Item with a fresh</w:t>
+      </w:r>
+      <w:r>
+        <w:t xml:space="preserve"> </w:t>
+      </w:r>
+      <w:r>
+        <w:rPr>
+          <w:rStyle w:val="VerbatimChar"/>
+        </w:rPr>
+        <w:t xml:space="preserve">LotName</w:t>
+      </w:r>
+      <w:r>
+        <w:t xml:space="preserve"> </w:t>
+      </w:r>
+      <w:r>
+        <w:t xml:space="preserve">minted from</w:t>
+      </w:r>
+      <w:r>
+        <w:t xml:space="preserve"> </w:t>
+      </w:r>
+      <w:r>
+        <w:rPr>
+          <w:rStyle w:val="VerbatimChar"/>
+        </w:rPr>
+        <w:t xml:space="preserve">Lots.IdentifierSequence_Next @Code='Lot'</w:t>
+      </w:r>
+      <w:r>
+        <w:t xml:space="preserve">;</w:t>
+      </w:r>
+      <w:r>
+        <w:t xml:space="preserve"> </w:t>
+      </w:r>
+      <w:r>
+        <w:rPr>
+          <w:rStyle w:val="VerbatimChar"/>
+        </w:rPr>
+        <w:t xml:space="preserve">Workorder.ConsumptionEvent</w:t>
+      </w:r>
+      <w:r>
+        <w:t xml:space="preserve"> </w:t>
+      </w:r>
+      <w:r>
+        <w:t xml:space="preserve">records the source trim LOT consumed and the machined LOT produced piece-for-piece;</w:t>
+      </w:r>
+      <w:r>
+        <w:t xml:space="preserve"> </w:t>
+      </w:r>
+      <w:r>
+        <w:rPr>
+          <w:rStyle w:val="VerbatimChar"/>
+        </w:rPr>
+        <w:t xml:space="preserve">Lots.LotGenealogy</w:t>
+      </w:r>
+      <w:r>
+        <w:t xml:space="preserve"> </w:t>
+      </w:r>
+      <w:r>
+        <w:t xml:space="preserve">records the parent/child link with</w:t>
+      </w:r>
+      <w:r>
+        <w:t xml:space="preserve"> </w:t>
+      </w:r>
+      <w:r>
+        <w:rPr>
+          <w:rStyle w:val="VerbatimChar"/>
+        </w:rPr>
+        <w:t xml:space="preserve">RelationshipType = Consumption</w:t>
+      </w:r>
+      <w:r>
+        <w:t xml:space="preserve">. The operator scans a fresh LTT for the new machined LOT. This is the</w:t>
+      </w:r>
+      <w:r>
+        <w:t xml:space="preserve"> </w:t>
+      </w:r>
+      <w:r>
+        <w:rPr>
+          <w:b/>
+          <w:bCs/>
+        </w:rPr>
+        <w:t xml:space="preserve">whole</w:t>
+      </w:r>
+      <w:r>
+        <w:t xml:space="preserve"> </w:t>
+      </w:r>
+      <w:r>
+        <w:t xml:space="preserve">LOT — any sub-LOT split for this line happens at Machining OUT, below.</w:t>
+      </w:r>
+    </w:p>
+    <w:p>
+      <w:pPr>
+        <w:pStyle w:val="CaptionedFigure"/>
+      </w:pPr>
+      <w:r>
+        <w:drawing>
+          <wp:inline>
+            <wp:extent cx="4716378" cy="3724976"/>
+            <wp:effectExtent b="0" l="0" r="0" t="0"/>
+            <wp:docPr descr="BOM-Driven Rename modal — Machining IN" title="" id="114" name="Picture"/>
+            <a:graphic>
+              <a:graphicData uri="http://schemas.openxmlformats.org/drawingml/2006/picture">
+                <pic:pic>
+                  <pic:nvPicPr>
+                    <pic:cNvPr descr="mockup_screenshots/Screenshot%202026-04-30%20124844.png" id="115" name="Picture"/>
+                    <pic:cNvPicPr>
+                      <a:picLocks noChangeArrowheads="1" noChangeAspect="1"/>
+                    </pic:cNvPicPr>
+                  </pic:nvPicPr>
+                  <pic:blipFill>
+                    <a:blip r:embed="rId113"/>
+                    <a:stretch>
+                      <a:fillRect/>
+                    </a:stretch>
+                  </pic:blipFill>
+                  <pic:spPr bwMode="auto">
+                    <a:xfrm>
+                      <a:off x="0" y="0"/>
+                      <a:ext cx="4716378" cy="3724976"/>
+                    </a:xfrm>
+                    <a:prstGeom prst="rect">
+                      <a:avLst/>
+                    </a:prstGeom>
+                    <a:noFill/>
+                    <a:ln w="9525">
+                      <a:noFill/>
+                      <a:headEnd/>
+                      <a:tailEnd/>
+                    </a:ln>
+                  </pic:spPr>
+                </pic:pic>
+              </a:graphicData>
+            </a:graphic>
+          </wp:inline>
+        </w:drawing>
+      </w:r>
+    </w:p>
+    <w:p>
+      <w:pPr>
+        <w:pStyle w:val="ImageCaption"/>
+      </w:pPr>
+      <w:r>
+        <w:t xml:space="preserve">BOM-Driven Rename modal — Machining IN</w:t>
+      </w:r>
+    </w:p>
+    <w:p>
+      <w:pPr>
+        <w:pStyle w:val="BodyText"/>
+      </w:pPr>
+      <w:r>
+        <w:rPr>
+          <w:i/>
+          <w:iCs/>
+        </w:rPr>
+        <w:t xml:space="preserve">Receive LOT — Rename to Machined Item modal: confirms the source LOT (LotName · Item · piece count) and the target Item (BOM-resolved) with the new LotName that will be minted. Confirm Receive fires ConsumptionEvent + LotGenealogy + new LOT creation in one transaction.</w:t>
+      </w:r>
+    </w:p>
+    <w:p>
+      <w:pPr>
+        <w:pStyle w:val="BodyText"/>
+      </w:pPr>
+      <w:r>
+        <w:t xml:space="preserve">The CNC runs. Some parts come out of tolerance — those are recorded as</w:t>
+      </w:r>
+      <w:r>
+        <w:t xml:space="preserve"> </w:t>
+      </w:r>
+      <w:r>
+        <w:rPr>
+          <w:rStyle w:val="VerbatimChar"/>
+        </w:rPr>
+        <w:t xml:space="preserve">RejectEvent</w:t>
+      </w:r>
+      <w:r>
+        <w:t xml:space="preserve"> </w:t>
+      </w:r>
+      <w:r>
+        <w:t xml:space="preserve">rows against the machined LOT (defect code MS-OOT-01, the operator-entered quantity, the operator’s initials). Good parts continue to accumulate.</w:t>
+      </w:r>
+    </w:p>
+    <w:p>
+      <w:pPr>
+        <w:pStyle w:val="BodyText"/>
+      </w:pPr>
+      <w:r>
+        <w:rPr>
+          <w:b/>
+          <w:bCs/>
+        </w:rPr>
+        <w:t xml:space="preserve">Machining OUT — split or move.</w:t>
+      </w:r>
+      <w:r>
+        <w:t xml:space="preserve"> </w:t>
+      </w:r>
+      <w:r>
+        <w:t xml:space="preserve">When the machining operation completes, the MES branches on the</w:t>
+      </w:r>
+      <w:r>
+        <w:t xml:space="preserve"> </w:t>
+      </w:r>
+      <w:r>
+        <w:rPr>
+          <w:rStyle w:val="VerbatimChar"/>
+        </w:rPr>
+        <w:t xml:space="preserve">MachiningOut</w:t>
+      </w:r>
+      <w:r>
+        <w:t xml:space="preserve"> </w:t>
+      </w:r>
+      <w:r>
+        <w:t xml:space="preserve">OperationTemplate’s</w:t>
+      </w:r>
+      <w:r>
+        <w:t xml:space="preserve"> </w:t>
+      </w:r>
+      <w:r>
+        <w:rPr>
+          <w:rStyle w:val="VerbatimChar"/>
+        </w:rPr>
+        <w:t xml:space="preserve">RequiresSubLotSplit</w:t>
+      </w:r>
+      <w:r>
+        <w:t xml:space="preserve"> </w:t>
+      </w:r>
+      <w:r>
+        <w:t xml:space="preserve">flag (the physical correlate is whether the line has a dedicated Machining OUT terminal):</w:t>
+      </w:r>
+    </w:p>
+    <w:p>
+      <w:pPr>
+        <w:pStyle w:val="BodyText"/>
+      </w:pPr>
+      <w:r>
+        <w:rPr>
+          <w:b/>
+          <w:bCs/>
+        </w:rPr>
+        <w:t xml:space="preserve">Path A — Sub-LOT split (sublotting lines,</w:t>
+      </w:r>
+      <w:r>
+        <w:rPr>
+          <w:b/>
+          <w:bCs/>
+        </w:rPr>
+        <w:t xml:space="preserve"> </w:t>
+      </w:r>
+      <w:r>
+        <w:rPr>
+          <w:rStyle w:val="VerbatimChar"/>
+          <w:b/>
+          <w:bCs/>
+        </w:rPr>
+        <w:t xml:space="preserve">RequiresSubLotSplit=1</w:t>
+      </w:r>
+      <w:r>
+        <w:rPr>
+          <w:b/>
+          <w:bCs/>
+        </w:rPr>
+        <w:t xml:space="preserve">, FDS-05-009).</w:t>
+      </w:r>
+      <w:r>
+        <w:t xml:space="preserve"> </w:t>
+      </w:r>
+      <w:r>
+        <w:t xml:space="preserve">This is where the split now happens. The operator triggers Machining OUT at the line’s Machining OUT terminal; the MES presents a split dialog — default N=2 even split, adjustable, total equals the parent piece count. For each sub-LOT the operator selects a destination by scan or dropdown (FDS-02-009). On confirm, the</w:t>
+      </w:r>
+      <w:r>
+        <w:t xml:space="preserve"> </w:t>
+      </w:r>
+      <w:r>
+        <w:rPr>
+          <w:b/>
+          <w:bCs/>
+        </w:rPr>
+        <w:t xml:space="preserve">machined</w:t>
+      </w:r>
+      <w:r>
+        <w:t xml:space="preserve"> </w:t>
+      </w:r>
+      <w:r>
+        <w:t xml:space="preserve">LOT (already renamed at Machining IN) splits into N machining-origin sub-LOTs:</w:t>
+      </w:r>
+      <w:r>
+        <w:t xml:space="preserve"> </w:t>
+      </w:r>
+      <w:r>
+        <w:rPr>
+          <w:rStyle w:val="VerbatimChar"/>
+        </w:rPr>
+        <w:t xml:space="preserve">LotGenealogy</w:t>
+      </w:r>
+      <w:r>
+        <w:t xml:space="preserve"> </w:t>
+      </w:r>
+      <w:r>
+        <w:t xml:space="preserve">records the parent→child Split links, a</w:t>
+      </w:r>
+      <w:r>
+        <w:t xml:space="preserve"> </w:t>
+      </w:r>
+      <w:r>
+        <w:rPr>
+          <w:rStyle w:val="VerbatimChar"/>
+        </w:rPr>
+        <w:t xml:space="preserve">LotMovement</w:t>
+      </w:r>
+      <w:r>
+        <w:t xml:space="preserve"> </w:t>
+      </w:r>
+      <w:r>
+        <w:t xml:space="preserve">routes each child to its destination, and LTT labels print showing child + parent</w:t>
+      </w:r>
+      <w:r>
+        <w:t xml:space="preserve"> </w:t>
+      </w:r>
+      <w:r>
+        <w:rPr>
+          <w:rStyle w:val="VerbatimChar"/>
+        </w:rPr>
+        <w:t xml:space="preserve">LotName</w:t>
+      </w:r>
+      <w:r>
+        <w:t xml:space="preserve"> </w:t>
+      </w:r>
+      <w:r>
+        <w:t xml:space="preserve">(FDS-05-024).</w:t>
+      </w:r>
+    </w:p>
+    <w:p>
+      <w:pPr>
+        <w:pStyle w:val="CaptionedFigure"/>
+      </w:pPr>
+      <w:r>
+        <w:drawing>
+          <wp:inline>
+            <wp:extent cx="5334000" cy="1126940"/>
+            <wp:effectExtent b="0" l="0" r="0" t="0"/>
+            <wp:docPr descr="Sub-LOT Distribution — 2 destinations, 48 pcs split 24/24" title="" id="117" name="Picture"/>
+            <a:graphic>
+              <a:graphicData uri="http://schemas.openxmlformats.org/drawingml/2006/picture">
+                <pic:pic>
+                  <pic:nvPicPr>
+                    <pic:cNvPr descr="mockup_screenshots/Screenshot%202026-04-30%20124742.png" id="118" name="Picture"/>
+                    <pic:cNvPicPr>
+                      <a:picLocks noChangeArrowheads="1" noChangeAspect="1"/>
+                    </pic:cNvPicPr>
+                  </pic:nvPicPr>
+                  <pic:blipFill>
+                    <a:blip r:embed="rId116"/>
                     <a:stretch>
                       <a:fillRect/>
                     </a:stretch>
@@ -5915,473 +6816,50 @@
           <w:i/>
           <w:iCs/>
         </w:rPr>
-        <w:t xml:space="preserve">Sub-LOT Distribution panel: Total pieces shown at top right. Each row is a destination sub-LOT — operator enters Pieces and selects a Destination Machining Cell from a dropdown showing queue depth. + Add sub-LOT adds another row. Same Flex Repeater renders 1 row when RequiresSubLotSplit=0 (whole move) or N rows when =1. Submit · TrimOut + Split + Route commits in one transaction.</w:t>
-      </w:r>
-    </w:p>
-    <w:p>
-      <w:pPr>
-        <w:pStyle w:val="CaptionedFigure"/>
-      </w:pPr>
-      <w:r>
-        <w:drawing>
-          <wp:inline>
-            <wp:extent cx="5334000" cy="2629397"/>
-            <wp:effectExtent b="0" l="0" r="0" t="0"/>
-            <wp:docPr descr="Trim Station — Error state, LOT not at this Cell" title="" id="110" name="Picture"/>
-            <a:graphic>
-              <a:graphicData uri="http://schemas.openxmlformats.org/drawingml/2006/picture">
-                <pic:pic>
-                  <pic:nvPicPr>
-                    <pic:cNvPr descr="mockup_screenshots/Screenshot%202026-04-30%20124755.png" id="111" name="Picture"/>
-                    <pic:cNvPicPr>
-                      <a:picLocks noChangeArrowheads="1" noChangeAspect="1"/>
-                    </pic:cNvPicPr>
-                  </pic:nvPicPr>
-                  <pic:blipFill>
-                    <a:blip r:embed="rId109"/>
-                    <a:stretch>
-                      <a:fillRect/>
-                    </a:stretch>
-                  </pic:blipFill>
-                  <pic:spPr bwMode="auto">
-                    <a:xfrm>
-                      <a:off x="0" y="0"/>
-                      <a:ext cx="5334000" cy="2629397"/>
-                    </a:xfrm>
-                    <a:prstGeom prst="rect">
-                      <a:avLst/>
-                    </a:prstGeom>
-                    <a:noFill/>
-                    <a:ln w="9525">
-                      <a:noFill/>
-                      <a:headEnd/>
-                      <a:tailEnd/>
-                    </a:ln>
-                  </pic:spPr>
-                </pic:pic>
-              </a:graphicData>
-            </a:graphic>
-          </wp:inline>
-        </w:drawing>
-      </w:r>
-    </w:p>
-    <w:p>
-      <w:pPr>
-        <w:pStyle w:val="ImageCaption"/>
-      </w:pPr>
-      <w:r>
-        <w:t xml:space="preserve">Trim Station — Error state, LOT not at this Cell</w:t>
-      </w:r>
-    </w:p>
-    <w:p>
-      <w:pPr>
-        <w:pStyle w:val="BodyText"/>
-      </w:pPr>
+        <w:t xml:space="preserve">Sub-LOT Distribution panel: Total pieces shown at top right. Each row is a destination sub-LOT — operator enters Pieces and selects a destination from a dropdown showing queue depth. + Add sub-LOT adds another row. Single submit commits the split + route in one transaction.</w:t>
+      </w:r>
       <w:r>
         <w:rPr>
           <w:i/>
           <w:iCs/>
         </w:rPr>
-        <w:t xml:space="preserve">Error state: scanned LOT is not in storage and is not currently active here. The CAN’T PROCESS THIS LOT HERE panel shows the scanned LotName, its current location (already past Trim), and who checked it in. Operator returns the basket to the storage queue; LOT Detail lookup is a supervisor / elevated action.</w:t>
-      </w:r>
-    </w:p>
-    <w:bookmarkEnd w:id="112"/>
-    <w:bookmarkStart w:id="119" w:name="X33b4f3c9a0224f726c67dbc69ec4a6e4d562a08"/>
-    <w:p>
-      <w:pPr>
-        <w:pStyle w:val="Heading3"/>
-      </w:pPr>
-      <w:r>
-        <w:t xml:space="preserve">10:00am — Machining: Picking from FIFO + Identity Rename</w:t>
-      </w:r>
-    </w:p>
-    <w:p>
-      <w:pPr>
-        <w:pStyle w:val="FirstParagraph"/>
-      </w:pPr>
-      <w:r>
-        <w:t xml:space="preserve">The sub-LOTs that were routed at Trim OUT are now sitting in the destination Machining Cells’ FIFO queues, waiting. At CNC machine 12, the machining operator (a different operator, not Carlos) walks up to the Cell’s terminal. The screen surfaces the</w:t>
-      </w:r>
-      <w:r>
         <w:t xml:space="preserve"> </w:t>
       </w:r>
       <w:r>
         <w:rPr>
           <w:b/>
           <w:bCs/>
-        </w:rPr>
-        <w:t xml:space="preserve">Machining IN</w:t>
-      </w:r>
-      <w:r>
-        <w:t xml:space="preserve"> </w:t>
-      </w:r>
-      <w:r>
-        <w:t xml:space="preserve">view — there’s no LTT scan-to-receive at this step. The terminal shows the FIFO queue for this Cell with each sub-LOT’s</w:t>
-      </w:r>
-      <w:r>
-        <w:t xml:space="preserve"> </w:t>
-      </w:r>
-      <w:r>
-        <w:rPr>
-          <w:rStyle w:val="VerbatimChar"/>
-        </w:rPr>
-        <w:t xml:space="preserve">LotName</w:t>
-      </w:r>
-      <w:r>
-        <w:t xml:space="preserve">, parent LOT, piece count, and arrival time. The operator picks the next one in line (or overrides the order if production needs require it, per FRS 2.2.4).</w:t>
-      </w:r>
-    </w:p>
-    <w:p>
-      <w:pPr>
-        <w:pStyle w:val="CaptionedFigure"/>
-      </w:pPr>
-      <w:r>
-        <w:drawing>
-          <wp:inline>
-            <wp:extent cx="5334000" cy="2640538"/>
-            <wp:effectExtent b="0" l="0" r="0" t="0"/>
-            <wp:docPr descr="Machining IN — FIFO queue, 3 sub-LOTs awaiting" title="" id="114" name="Picture"/>
-            <a:graphic>
-              <a:graphicData uri="http://schemas.openxmlformats.org/drawingml/2006/picture">
-                <pic:pic>
-                  <pic:nvPicPr>
-                    <pic:cNvPr descr="mockup_screenshots/Screenshot%202026-04-30%20124828.png" id="115" name="Picture"/>
-                    <pic:cNvPicPr>
-                      <a:picLocks noChangeArrowheads="1" noChangeAspect="1"/>
-                    </pic:cNvPicPr>
-                  </pic:nvPicPr>
-                  <pic:blipFill>
-                    <a:blip r:embed="rId113"/>
-                    <a:stretch>
-                      <a:fillRect/>
-                    </a:stretch>
-                  </pic:blipFill>
-                  <pic:spPr bwMode="auto">
-                    <a:xfrm>
-                      <a:off x="0" y="0"/>
-                      <a:ext cx="5334000" cy="2640538"/>
-                    </a:xfrm>
-                    <a:prstGeom prst="rect">
-                      <a:avLst/>
-                    </a:prstGeom>
-                    <a:noFill/>
-                    <a:ln w="9525">
-                      <a:noFill/>
-                      <a:headEnd/>
-                      <a:tailEnd/>
-                    </a:ln>
-                  </pic:spPr>
-                </pic:pic>
-              </a:graphicData>
-            </a:graphic>
-          </wp:inline>
-        </w:drawing>
-      </w:r>
-    </w:p>
-    <w:p>
-      <w:pPr>
-        <w:pStyle w:val="ImageCaption"/>
-      </w:pPr>
-      <w:r>
-        <w:t xml:space="preserve">Machining IN — FIFO queue, 3 sub-LOTs awaiting</w:t>
-      </w:r>
-    </w:p>
-    <w:p>
-      <w:pPr>
-        <w:pStyle w:val="BodyText"/>
-      </w:pPr>
-      <w:r>
-        <w:rPr>
           <w:i/>
           <w:iCs/>
         </w:rPr>
-        <w:t xml:space="preserve">Machining IN screen: no scan-to-receive. FIFO Queue panel lists sub-LOTs in arrival order with Position, LotName, parent LOT, Item, piece count, and arrival time. GOOD badge allows pick; HOLD badge blocks it. Pick (skip queue) is available on non-oldest positions. Active Machined LOT section below fills after a pick confirms.</w:t>
-      </w:r>
-    </w:p>
-    <w:p>
-      <w:pPr>
-        <w:pStyle w:val="BodyText"/>
-      </w:pPr>
-      <w:r>
-        <w:t xml:space="preserve">On pick, the MES applies the</w:t>
-      </w:r>
-      <w:r>
-        <w:t xml:space="preserve"> </w:t>
+        <w:t xml:space="preserve">(Screenshot predates the 2026-06 relocation — its banner reads</w:t>
       </w:r>
       <w:r>
         <w:rPr>
           <w:b/>
           <w:bCs/>
-        </w:rPr>
-        <w:t xml:space="preserve">BOM-driven part-identity rename</w:t>
-      </w:r>
-      <w:r>
-        <w:t xml:space="preserve">. The picked sub-LOT carries Item</w:t>
-      </w:r>
-      <w:r>
-        <w:t xml:space="preserve"> </w:t>
-      </w:r>
-      <w:r>
-        <w:rPr>
-          <w:rStyle w:val="VerbatimChar"/>
-        </w:rPr>
-        <w:t xml:space="preserve">5G0-TRIM-4102</w:t>
-      </w:r>
-      <w:r>
-        <w:t xml:space="preserve">; the active</w:t>
-      </w:r>
-      <w:r>
-        <w:t xml:space="preserve"> </w:t>
-      </w:r>
-      <w:r>
-        <w:rPr>
-          <w:rStyle w:val="VerbatimChar"/>
-        </w:rPr>
-        <w:t xml:space="preserve">Parts.Bom</w:t>
-      </w:r>
-      <w:r>
-        <w:t xml:space="preserve"> </w:t>
-      </w:r>
-      <w:r>
-        <w:t xml:space="preserve">for</w:t>
-      </w:r>
-      <w:r>
-        <w:t xml:space="preserve"> </w:t>
-      </w:r>
-      <w:r>
-        <w:rPr>
-          <w:rStyle w:val="VerbatimChar"/>
-        </w:rPr>
-        <w:t xml:space="preserve">5G0-MACHINED-4102</w:t>
-      </w:r>
-      <w:r>
-        <w:t xml:space="preserve"> </w:t>
-      </w:r>
-      <w:r>
-        <w:t xml:space="preserve">has a single</w:t>
-      </w:r>
-      <w:r>
-        <w:t xml:space="preserve"> </w:t>
-      </w:r>
-      <w:r>
-        <w:rPr>
-          <w:rStyle w:val="VerbatimChar"/>
-        </w:rPr>
-        <w:t xml:space="preserve">BomLine</w:t>
-      </w:r>
-      <w:r>
-        <w:t xml:space="preserve"> </w:t>
-      </w:r>
-      <w:r>
-        <w:t xml:space="preserve">with</w:t>
-      </w:r>
-      <w:r>
-        <w:t xml:space="preserve"> </w:t>
-      </w:r>
-      <w:r>
-        <w:rPr>
-          <w:rStyle w:val="VerbatimChar"/>
-        </w:rPr>
-        <w:t xml:space="preserve">ChildItemId = 5G0-TRIM-4102</w:t>
-      </w:r>
-      <w:r>
-        <w:t xml:space="preserve"> </w:t>
-      </w:r>
-      <w:r>
-        <w:t xml:space="preserve">at QtyPer=1. The MES prompts:</w:t>
-      </w:r>
-      <w:r>
-        <w:t xml:space="preserve"> </w:t>
-      </w:r>
-      <w:r>
-        <w:rPr>
           <w:i/>
           <w:iCs/>
         </w:rPr>
-        <w:t xml:space="preserve">“This LOT is 5G0-TRIM-4102. Receive as 5G0-MACHINED-4102?”</w:t>
-      </w:r>
-      <w:r>
-        <w:t xml:space="preserve"> </w:t>
-      </w:r>
-      <w:r>
-        <w:t xml:space="preserve">The operator confirms. A new destination LOT is created under the machined Item with a fresh</w:t>
-      </w:r>
-      <w:r>
-        <w:t xml:space="preserve"> </w:t>
-      </w:r>
-      <w:r>
-        <w:rPr>
-          <w:rStyle w:val="VerbatimChar"/>
-        </w:rPr>
-        <w:t xml:space="preserve">LotName</w:t>
-      </w:r>
-      <w:r>
-        <w:t xml:space="preserve"> </w:t>
-      </w:r>
-      <w:r>
-        <w:t xml:space="preserve">minted from</w:t>
-      </w:r>
-      <w:r>
-        <w:t xml:space="preserve"> </w:t>
-      </w:r>
-      <w:r>
-        <w:rPr>
-          <w:rStyle w:val="VerbatimChar"/>
-        </w:rPr>
-        <w:t xml:space="preserve">Lots.IdentifierSequence_Next @Code='Lot'</w:t>
-      </w:r>
-      <w:r>
-        <w:t xml:space="preserve">;</w:t>
-      </w:r>
-      <w:r>
-        <w:t xml:space="preserve"> </w:t>
-      </w:r>
-      <w:r>
-        <w:rPr>
-          <w:rStyle w:val="VerbatimChar"/>
-        </w:rPr>
-        <w:t xml:space="preserve">Workorder.ConsumptionEvent</w:t>
-      </w:r>
-      <w:r>
-        <w:t xml:space="preserve"> </w:t>
-      </w:r>
-      <w:r>
-        <w:t xml:space="preserve">records the source trim LOT consumed and the machined LOT produced piece-for-piece;</w:t>
-      </w:r>
-      <w:r>
-        <w:t xml:space="preserve"> </w:t>
-      </w:r>
-      <w:r>
-        <w:rPr>
-          <w:rStyle w:val="VerbatimChar"/>
-        </w:rPr>
-        <w:t xml:space="preserve">Lots.LotGenealogy</w:t>
-      </w:r>
-      <w:r>
-        <w:t xml:space="preserve"> </w:t>
-      </w:r>
-      <w:r>
-        <w:t xml:space="preserve">records the parent/child link with</w:t>
-      </w:r>
-      <w:r>
-        <w:t xml:space="preserve"> </w:t>
-      </w:r>
-      <w:r>
-        <w:rPr>
-          <w:rStyle w:val="VerbatimChar"/>
-        </w:rPr>
-        <w:t xml:space="preserve">RelationshipType = Consumption</w:t>
-      </w:r>
-      <w:r>
-        <w:t xml:space="preserve">. The operator scans a fresh LTT for the new machined LOT.</w:t>
-      </w:r>
-    </w:p>
-    <w:p>
-      <w:pPr>
-        <w:pStyle w:val="CaptionedFigure"/>
-      </w:pPr>
-      <w:r>
-        <w:drawing>
-          <wp:inline>
-            <wp:extent cx="4716378" cy="3724976"/>
-            <wp:effectExtent b="0" l="0" r="0" t="0"/>
-            <wp:docPr descr="BOM-Driven Rename modal — Machining IN" title="" id="117" name="Picture"/>
-            <a:graphic>
-              <a:graphicData uri="http://schemas.openxmlformats.org/drawingml/2006/picture">
-                <pic:pic>
-                  <pic:nvPicPr>
-                    <pic:cNvPr descr="mockup_screenshots/Screenshot%202026-04-30%20124844.png" id="118" name="Picture"/>
-                    <pic:cNvPicPr>
-                      <a:picLocks noChangeArrowheads="1" noChangeAspect="1"/>
-                    </pic:cNvPicPr>
-                  </pic:nvPicPr>
-                  <pic:blipFill>
-                    <a:blip r:embed="rId116"/>
-                    <a:stretch>
-                      <a:fillRect/>
-                    </a:stretch>
-                  </pic:blipFill>
-                  <pic:spPr bwMode="auto">
-                    <a:xfrm>
-                      <a:off x="0" y="0"/>
-                      <a:ext cx="4716378" cy="3724976"/>
-                    </a:xfrm>
-                    <a:prstGeom prst="rect">
-                      <a:avLst/>
-                    </a:prstGeom>
-                    <a:noFill/>
-                    <a:ln w="9525">
-                      <a:noFill/>
-                      <a:headEnd/>
-                      <a:tailEnd/>
-                    </a:ln>
-                  </pic:spPr>
-                </pic:pic>
-              </a:graphicData>
-            </a:graphic>
-          </wp:inline>
-        </w:drawing>
-      </w:r>
-    </w:p>
-    <w:p>
-      <w:pPr>
-        <w:pStyle w:val="ImageCaption"/>
-      </w:pPr>
-      <w:r>
-        <w:t xml:space="preserve">BOM-Driven Rename modal — Machining IN</w:t>
-      </w:r>
-    </w:p>
-    <w:p>
-      <w:pPr>
-        <w:pStyle w:val="BodyText"/>
-      </w:pPr>
-      <w:r>
-        <w:rPr>
+        <w:t xml:space="preserve"> </w:t>
+      </w:r>
+      <w:r>
+        <w:rPr>
+          <w:b/>
+          <w:bCs/>
           <w:i/>
           <w:iCs/>
         </w:rPr>
-        <w:t xml:space="preserve">Receive sub-LOT — Rename to Machined Item modal: confirms the source sub-LOT (LotName · Item · piece count) and the target Item (BOM-resolved) with the new LotName that will be minted. Confirm Receive fires ConsumptionEvent + LotGenealogy + new LOT creation in one transaction.</w:t>
-      </w:r>
-    </w:p>
-    <w:p>
-      <w:pPr>
-        <w:pStyle w:val="BodyText"/>
-      </w:pPr>
-      <w:r>
-        <w:t xml:space="preserve">The CNC runs. Some parts come out of tolerance — those are recorded as</w:t>
-      </w:r>
-      <w:r>
-        <w:t xml:space="preserve"> </w:t>
-      </w:r>
-      <w:r>
-        <w:rPr>
-          <w:rStyle w:val="VerbatimChar"/>
-        </w:rPr>
-        <w:t xml:space="preserve">RejectEvent</w:t>
-      </w:r>
-      <w:r>
-        <w:t xml:space="preserve"> </w:t>
-      </w:r>
-      <w:r>
-        <w:t xml:space="preserve">rows against the machined LOT (defect code MS-OOT-01, the operator-entered quantity, the operator’s initials). Good parts continue to accumulate.</w:t>
-      </w:r>
-    </w:p>
-    <w:p>
-      <w:pPr>
-        <w:pStyle w:val="BodyText"/>
-      </w:pPr>
+        <w:t xml:space="preserve">“TrimOut + Split + Route”</w:t>
+      </w:r>
       <w:r>
         <w:rPr>
           <w:b/>
           <w:bCs/>
-        </w:rPr>
-        <w:t xml:space="preserve">Machining OUT — two possible paths.</w:t>
-      </w:r>
-      <w:r>
-        <w:t xml:space="preserve"> </w:t>
-      </w:r>
-      <w:r>
-        <w:t xml:space="preserve">When the machining operation completes, one of two things happens depending on how the cell is configured:</w:t>
+          <w:i/>
+          <w:iCs/>
+        </w:rPr>
+        <w:t xml:space="preserve">; this UX now lives at Machining OUT. Pending re-capture.)</w:t>
       </w:r>
     </w:p>
     <w:p>
@@ -6393,31 +6871,47 @@
           <w:b/>
           <w:bCs/>
         </w:rPr>
-        <w:t xml:space="preserve">Path A — PLC-driven auto-move (FDS-06-008).</w:t>
-      </w:r>
-      <w:r>
-        <w:t xml:space="preserve"> </w:t>
-      </w:r>
-      <w:r>
-        <w:t xml:space="preserve">If the cell is integrated with a PLC and has a coupled downstream assembly cell configured, the machine signals completion and the MES automatically records the operation completion and moves the LOT to the paired Assembly Cell. The operator never touches the terminal for Machining OUT — the basket physically rolls to Assembly and the MES has already recorded the move.</w:t>
-      </w:r>
-    </w:p>
-    <w:p>
-      <w:pPr>
-        <w:pStyle w:val="BodyText"/>
-      </w:pPr>
+        <w:t xml:space="preserve">Path B — PLC-driven auto-move (non-sublotting coupled lines, FDS-06-008).</w:t>
+      </w:r>
+      <w:r>
+        <w:t xml:space="preserve"> </w:t>
+      </w:r>
+      <w:r>
+        <w:t xml:space="preserve">If the line does not sublot and the cell has a coupled downstream Assembly Cell configured, the machine signals completion and the MES automatically records the completion and moves the</w:t>
+      </w:r>
+      <w:r>
+        <w:t xml:space="preserve"> </w:t>
+      </w:r>
       <w:r>
         <w:rPr>
           <w:b/>
           <w:bCs/>
         </w:rPr>
-        <w:t xml:space="preserve">Path B — Operator-driven movement.</w:t>
-      </w:r>
-      <w:r>
-        <w:t xml:space="preserve"> </w:t>
-      </w:r>
-      <w:r>
-        <w:t xml:space="preserve">If there is no PLC integration, or the cell is not paired with a downstream cell, the MES records the operation completion but the LOT stays at the Machining Cell. An operator must manually scan the LOT at the next station to trigger the movement — the same scan-to-receive pattern used at Trim IN.</w:t>
+        <w:t xml:space="preserve">whole</w:t>
+      </w:r>
+      <w:r>
+        <w:t xml:space="preserve"> </w:t>
+      </w:r>
+      <w:r>
+        <w:t xml:space="preserve">LOT to the paired Assembly Cell. The operator never touches the terminal for Machining OUT — the basket physically rolls to Assembly and the MES has already recorded the move.</w:t>
+      </w:r>
+    </w:p>
+    <w:p>
+      <w:pPr>
+        <w:pStyle w:val="BodyText"/>
+      </w:pPr>
+      <w:r>
+        <w:rPr>
+          <w:b/>
+          <w:bCs/>
+        </w:rPr>
+        <w:t xml:space="preserve">Path C — Operator-driven movement (uncoupled lines).</w:t>
+      </w:r>
+      <w:r>
+        <w:t xml:space="preserve"> </w:t>
+      </w:r>
+      <w:r>
+        <w:t xml:space="preserve">If there is no PLC integration, or the cell is not paired with a downstream cell, the MES records the completion but the LOT stays at the Machining Cell. An operator manually scans the LOT at the next station to trigger the movement — the same scan-to-receive pattern used at Trim IN.</w:t>
       </w:r>
     </w:p>
     <w:bookmarkEnd w:id="119"/>
@@ -8892,13 +9386,13 @@
           <w:b/>
           <w:bCs/>
         </w:rPr>
-        <w:t xml:space="preserve">Decision (2026-04-09, corrected 2026-04-29 per FDS v0.11m):</w:t>
-      </w:r>
-      <w:r>
-        <w:t xml:space="preserve"> </w:t>
-      </w:r>
-      <w:r>
-        <w:t xml:space="preserve">At</w:t>
+        <w:t xml:space="preserve">Decision (2026-06-04 — confirmed with MPP; supersedes the 2026-04-29 Trim-OUT correction):</w:t>
+      </w:r>
+      <w:r>
+        <w:t xml:space="preserve"> </w:t>
+      </w:r>
+      <w:r>
+        <w:t xml:space="preserve">The split happens at</w:t>
       </w:r>
       <w:r>
         <w:t xml:space="preserve"> </w:t>
@@ -8908,68 +9402,95 @@
           <w:b/>
           <w:bCs/>
         </w:rPr>
-        <w:t xml:space="preserve">Trim OUT</w:t>
-      </w:r>
-      <w:r>
-        <w:t xml:space="preserve">, the Trim operator triggers the sub-LOT split. The system presents a confirmation dialog — default N=2 sublots, evenly split — and the operator selects a destination Machining Cell for each child by scan or dropdown. Sublots are treated as LOT splits in the data model (</w:t>
-      </w:r>
-      <w:r>
-        <w:rPr>
-          <w:rStyle w:val="VerbatimChar"/>
-        </w:rPr>
-        <w:t xml:space="preserve">LotGenealogy</w:t>
-      </w:r>
-      <w:r>
-        <w:t xml:space="preserve"> </w:t>
-      </w:r>
-      <w:r>
-        <w:t xml:space="preserve">with</w:t>
-      </w:r>
-      <w:r>
-        <w:t xml:space="preserve"> </w:t>
-      </w:r>
-      <w:r>
-        <w:rPr>
-          <w:rStyle w:val="VerbatimChar"/>
-        </w:rPr>
-        <w:t xml:space="preserve">RelationshipType = Split</w:t>
-      </w:r>
-      <w:r>
-        <w:t xml:space="preserve">). Operator can adjust quantities or sublot count before confirming; total must equal parent piece count. Needs review with Ben on per-Item override quantities.</w:t>
-      </w:r>
-    </w:p>
-    <w:p>
-      <w:pPr>
-        <w:pStyle w:val="BodyText"/>
-      </w:pPr>
+        <w:t xml:space="preserve">Machining OUT</w:t>
+      </w:r>
+      <w:r>
+        <w:t xml:space="preserve">, not Trim OUT — the original machining-initiated assumption above was right. Trim is a 1:1 whole-LOT move tracked at Area resolution (check-in → process → check-out, no split). At Machining OUT, on lines that sublot (physical signature: a dedicated Machining OUT terminal,</w:t>
+      </w:r>
+      <w:r>
+        <w:t xml:space="preserve"> </w:t>
+      </w:r>
+      <w:r>
+        <w:rPr>
+          <w:rStyle w:val="VerbatimChar"/>
+        </w:rPr>
+        <w:t xml:space="preserve">RequiresSubLotSplit=1</w:t>
+      </w:r>
+      <w:r>
+        <w:t xml:space="preserve"> </w:t>
+      </w:r>
+      <w:r>
+        <w:t xml:space="preserve">on the</w:t>
+      </w:r>
+      <w:r>
+        <w:t xml:space="preserve"> </w:t>
+      </w:r>
+      <w:r>
+        <w:rPr>
+          <w:rStyle w:val="VerbatimChar"/>
+        </w:rPr>
+        <w:t xml:space="preserve">MachiningOut</w:t>
+      </w:r>
+      <w:r>
+        <w:t xml:space="preserve"> </w:t>
+      </w:r>
+      <w:r>
+        <w:t xml:space="preserve">template), the operator triggers the split — default N=2 even split, adjustable, total must equal the parent piece count — and selects a destination per child by scan or dropdown (FDS-02-009). The parent being split is the</w:t>
+      </w:r>
+      <w:r>
+        <w:t xml:space="preserve"> </w:t>
+      </w:r>
       <w:r>
         <w:rPr>
           <w:b/>
           <w:bCs/>
         </w:rPr>
-        <w:t xml:space="preserve">Clarification (2026-04-23, v0.8):</w:t>
-      </w:r>
-      <w:r>
-        <w:t xml:space="preserve"> </w:t>
-      </w:r>
-      <w:r>
-        <w:t xml:space="preserve">Sub-LOT split is the</w:t>
-      </w:r>
-      <w:r>
-        <w:t xml:space="preserve"> </w:t>
-      </w:r>
+        <w:t xml:space="preserve">machined</w:t>
+      </w:r>
+      <w:r>
+        <w:t xml:space="preserve"> </w:t>
+      </w:r>
+      <w:r>
+        <w:t xml:space="preserve">LOT (the Trim → Machining rename already fired at Machining IN per FDS-05-033), so children are machining-origin sub-LOTs recorded as</w:t>
+      </w:r>
+      <w:r>
+        <w:t xml:space="preserve"> </w:t>
+      </w:r>
+      <w:r>
+        <w:rPr>
+          <w:rStyle w:val="VerbatimChar"/>
+        </w:rPr>
+        <w:t xml:space="preserve">LotGenealogy</w:t>
+      </w:r>
+      <w:r>
+        <w:t xml:space="preserve"> </w:t>
+      </w:r>
+      <w:r>
+        <w:rPr>
+          <w:rStyle w:val="VerbatimChar"/>
+        </w:rPr>
+        <w:t xml:space="preserve">RelationshipType = Split</w:t>
+      </w:r>
+      <w:r>
+        <w:t xml:space="preserve">. Lines without a Machining OUT terminal feed the coupled Assembly Cell whole (FDS-06-008). Still pending Ben on per-Item override quantities. See FDS-05-009 / FDS-06-008, Data Model v1.9n, and Phased Plan v1.1 Phase 5.</w:t>
+      </w:r>
+    </w:p>
+    <w:p>
+      <w:pPr>
+        <w:pStyle w:val="BodyText"/>
+      </w:pPr>
       <w:r>
         <w:rPr>
           <w:b/>
           <w:bCs/>
         </w:rPr>
-        <w:t xml:space="preserve">Trim OUT</w:t>
-      </w:r>
-      <w:r>
-        <w:t xml:space="preserve"> </w:t>
-      </w:r>
-      <w:r>
-        <w:t xml:space="preserve">sublot pattern (parent FK + split genealogy).</w:t>
+        <w:t xml:space="preserve">Superseded (2026-04-09, corrected 2026-04-29 per FDS v0.11m — reversed 2026-06-04):</w:t>
+      </w:r>
+      <w:r>
+        <w:t xml:space="preserve"> </w:t>
+      </w:r>
+      <w:r>
+        <w:t xml:space="preserve">Had placed the split at</w:t>
       </w:r>
       <w:r>
         <w:t xml:space="preserve"> </w:t>
@@ -8979,6 +9500,37 @@
           <w:b/>
           <w:bCs/>
         </w:rPr>
+        <w:t xml:space="preserve">Trim OUT</w:t>
+      </w:r>
+      <w:r>
+        <w:t xml:space="preserve">, distributing the trimmed LOT across N Machining Cells. MPP confirmed in June 2026 that the split is at Machining OUT; the Trim-OUT design is retired.</w:t>
+      </w:r>
+    </w:p>
+    <w:p>
+      <w:pPr>
+        <w:pStyle w:val="BodyText"/>
+      </w:pPr>
+      <w:r>
+        <w:rPr>
+          <w:b/>
+          <w:bCs/>
+        </w:rPr>
+        <w:t xml:space="preserve">Clarification:</w:t>
+      </w:r>
+      <w:r>
+        <w:t xml:space="preserve"> </w:t>
+      </w:r>
+      <w:r>
+        <w:t xml:space="preserve">Sub-LOT split is the Machining sublot pattern (parent FK + split genealogy, now at Machining OUT).</w:t>
+      </w:r>
+      <w:r>
+        <w:t xml:space="preserve"> </w:t>
+      </w:r>
+      <w:r>
+        <w:rPr>
+          <w:b/>
+          <w:bCs/>
+        </w:rPr>
         <w:t xml:space="preserve">Cavity-parallel LOTs at Die Cast are NOT sublots</w:t>
       </w:r>
       <w:r>
@@ -9146,7 +9698,7 @@
         <w:t xml:space="preserve"> </w:t>
       </w:r>
       <w:r>
-        <w:t xml:space="preserve">(camera validates each part pass/fail, PLC asserts</w:t>
+        <w:t xml:space="preserve">(camera validates the full tray as a single image — one event per tray — PLC asserts</w:t>
       </w:r>
       <w:r>
         <w:t xml:space="preserve"> </w:t>
@@ -9210,6 +9762,156 @@
         <w:t xml:space="preserve">OI-02 closed.</w:t>
       </w:r>
     </w:p>
+    <w:p>
+      <w:pPr>
+        <w:pStyle w:val="BodyText"/>
+      </w:pPr>
+      <w:r>
+        <w:rPr>
+          <w:b/>
+          <w:bCs/>
+        </w:rPr>
+        <w:t xml:space="preserve">Addendum (2026-06-04 — customer-dependent completion):</w:t>
+      </w:r>
+      <w:r>
+        <w:t xml:space="preserve"> </w:t>
+      </w:r>
+      <w:r>
+        <w:t xml:space="preserve">Because</w:t>
+      </w:r>
+      <w:r>
+        <w:t xml:space="preserve"> </w:t>
+      </w:r>
+      <w:r>
+        <w:rPr>
+          <w:rStyle w:val="VerbatimChar"/>
+        </w:rPr>
+        <w:t xml:space="preserve">ContainerConfig</w:t>
+      </w:r>
+      <w:r>
+        <w:t xml:space="preserve"> </w:t>
+      </w:r>
+      <w:r>
+        <w:t xml:space="preserve">is</w:t>
+      </w:r>
+      <w:r>
+        <w:t xml:space="preserve"> </w:t>
+      </w:r>
+      <w:r>
+        <w:rPr>
+          <w:b/>
+          <w:bCs/>
+        </w:rPr>
+        <w:t xml:space="preserve">per-Item</w:t>
+      </w:r>
+      <w:r>
+        <w:t xml:space="preserve">, the closure method is effectively</w:t>
+      </w:r>
+      <w:r>
+        <w:t xml:space="preserve"> </w:t>
+      </w:r>
+      <w:r>
+        <w:rPr>
+          <w:b/>
+          <w:bCs/>
+        </w:rPr>
+        <w:t xml:space="preserve">per-customer</w:t>
+      </w:r>
+      <w:r>
+        <w:t xml:space="preserve"> </w:t>
+      </w:r>
+      <w:r>
+        <w:t xml:space="preserve">— the same physical line can run one customer’s part as</w:t>
+      </w:r>
+      <w:r>
+        <w:t xml:space="preserve"> </w:t>
+      </w:r>
+      <w:r>
+        <w:rPr>
+          <w:rStyle w:val="VerbatimChar"/>
+        </w:rPr>
+        <w:t xml:space="preserve">ByCount</w:t>
+      </w:r>
+      <w:r>
+        <w:t xml:space="preserve"> </w:t>
+      </w:r>
+      <w:r>
+        <w:t xml:space="preserve">and another’s as</w:t>
+      </w:r>
+      <w:r>
+        <w:t xml:space="preserve"> </w:t>
+      </w:r>
+      <w:r>
+        <w:rPr>
+          <w:rStyle w:val="VerbatimChar"/>
+        </w:rPr>
+        <w:t xml:space="preserve">ByVision</w:t>
+      </w:r>
+      <w:r>
+        <w:t xml:space="preserve"> </w:t>
+      </w:r>
+      <w:r>
+        <w:t xml:space="preserve">(the 6MA Cam Holder pattern: different customers, different assembly-out terminals). Engineering routes each customer’s part to a Cell that supports its method; the capability binding is</w:t>
+      </w:r>
+      <w:r>
+        <w:t xml:space="preserve"> </w:t>
+      </w:r>
+      <w:r>
+        <w:rPr>
+          <w:b/>
+          <w:bCs/>
+        </w:rPr>
+        <w:t xml:space="preserve">routing-trusted, not proc-enforced</w:t>
+      </w:r>
+      <w:r>
+        <w:t xml:space="preserve"> </w:t>
+      </w:r>
+      <w:r>
+        <w:t xml:space="preserve">(a</w:t>
+      </w:r>
+      <w:r>
+        <w:t xml:space="preserve"> </w:t>
+      </w:r>
+      <w:r>
+        <w:rPr>
+          <w:rStyle w:val="VerbatimChar"/>
+        </w:rPr>
+        <w:t xml:space="preserve">ByVision</w:t>
+      </w:r>
+      <w:r>
+        <w:t xml:space="preserve"> </w:t>
+      </w:r>
+      <w:r>
+        <w:t xml:space="preserve">part mis-routed to a count-only Cell simply never receives</w:t>
+      </w:r>
+      <w:r>
+        <w:t xml:space="preserve"> </w:t>
+      </w:r>
+      <w:r>
+        <w:rPr>
+          <w:rStyle w:val="VerbatimChar"/>
+        </w:rPr>
+        <w:t xml:space="preserve">TrayFullFlag</w:t>
+      </w:r>
+      <w:r>
+        <w:t xml:space="preserve">). Distinct from the per-Cell</w:t>
+      </w:r>
+      <w:r>
+        <w:t xml:space="preserve"> </w:t>
+      </w:r>
+      <w:r>
+        <w:rPr>
+          <w:rStyle w:val="VerbatimChar"/>
+        </w:rPr>
+        <w:t xml:space="preserve">ConfirmationMethod</w:t>
+      </w:r>
+      <w:r>
+        <w:t xml:space="preserve"> </w:t>
+      </w:r>
+      <w:r>
+        <w:t xml:space="preserve">attribute (part-identity verification, §10 / FDS-10-013) — possibly the same physical Cognex, but a separate concern.</w:t>
+      </w:r>
+    </w:p>
     <w:bookmarkEnd w:id="169"/>
     <w:bookmarkStart w:id="170" w:name="sort-cage-serial-number-migration-open"/>
     <w:p>
@@ -10203,7 +10905,50 @@
         <w:t xml:space="preserve"> </w:t>
       </w:r>
       <w:r>
-        <w:t xml:space="preserve">path.</w:t>
+        <w:t xml:space="preserve">path. Because the config is</w:t>
+      </w:r>
+      <w:r>
+        <w:t xml:space="preserve"> </w:t>
+      </w:r>
+      <w:r>
+        <w:rPr>
+          <w:b/>
+          <w:bCs/>
+        </w:rPr>
+        <w:t xml:space="preserve">per-Item</w:t>
+      </w:r>
+      <w:r>
+        <w:t xml:space="preserve">, completion method is per-customer — one line runs both</w:t>
+      </w:r>
+      <w:r>
+        <w:t xml:space="preserve"> </w:t>
+      </w:r>
+      <w:r>
+        <w:rPr>
+          <w:rStyle w:val="VerbatimChar"/>
+        </w:rPr>
+        <w:t xml:space="preserve">ByCount</w:t>
+      </w:r>
+      <w:r>
+        <w:t xml:space="preserve"> </w:t>
+      </w:r>
+      <w:r>
+        <w:t xml:space="preserve">and</w:t>
+      </w:r>
+      <w:r>
+        <w:t xml:space="preserve"> </w:t>
+      </w:r>
+      <w:r>
+        <w:rPr>
+          <w:rStyle w:val="VerbatimChar"/>
+        </w:rPr>
+        <w:t xml:space="preserve">ByVision</w:t>
+      </w:r>
+      <w:r>
+        <w:t xml:space="preserve"> </w:t>
+      </w:r>
+      <w:r>
+        <w:t xml:space="preserve">parts for different customers (see #4 addendum, 2026-06-04).</w:t>
       </w:r>
       <w:r>
         <w:t xml:space="preserve"> </w:t>

</xml_diff>

<commit_message>
docs(mockup): Trim OUT whole-move + new Machining OUT split view; re-capture screenshots
Mirror the sub-LOT split relocation (Trim OUT -> Machining OUT) into the plantFloor.html mockup: Trim OUT becomes a 1:1 whole-LOT move, Machining IN shows whole LOTs, and a new terminal/machining-out view carries the Sub-LOT Distribution split UX (6MA sublotting line) with its CSS route + nav link. Genealogy tree reordered so Split sits below the rename. Three screenshots re-captured from the updated mockup; User Journeys captions drop the pending-re-capture flags.
</commit_message>
<xml_diff>
--- a/MPP_MES_USER_JOURNEYS.docx
+++ b/MPP_MES_USER_JOURNEYS.docx
@@ -2035,7 +2035,7 @@
               <w:t xml:space="preserve">RequiresSubLotSplit=1</w:t>
             </w:r>
             <w:r>
-              <w:t xml:space="preserve">), Path B PLC auto-move (coupled), Path C operator move (uncoupled). The Sub-LOT Distribution screenshot relocated from Trim to Machining OUT. Three mockup screenshots (Trim Check-OUT, Machining IN queue, Sub-LOT Distribution) flagged</w:t>
+              <w:t xml:space="preserve">), Path B PLC auto-move (coupled), Path C operator move (uncoupled). The Sub-LOT Distribution screenshot relocated from Trim to Machining OUT. Three mockup screenshots (Trim Check-OUT, Machining IN queue, Machining OUT Sub-LOT Split)</w:t>
             </w:r>
             <w:r>
               <w:t xml:space="preserve"> </w:t>
@@ -2045,13 +2045,43 @@
                 <w:b/>
                 <w:bCs/>
               </w:rPr>
-              <w:t xml:space="preserve">pending re-capture</w:t>
-            </w:r>
-            <w:r>
-              <w:t xml:space="preserve"> </w:t>
-            </w:r>
-            <w:r>
-              <w:t xml:space="preserve">— they predate the relocation and still show the Trim-OUT-split UX. §3 (UJ-03) decision superseded — split is at Machining OUT (the original 2026-04-09 machining-initiated assumption was right). §4 + §13:</w:t>
+              <w:t xml:space="preserve">re-captured 2026-06-04</w:t>
+            </w:r>
+            <w:r>
+              <w:t xml:space="preserve"> </w:t>
+            </w:r>
+            <w:r>
+              <w:t xml:space="preserve">from the updated</w:t>
+            </w:r>
+            <w:r>
+              <w:t xml:space="preserve"> </w:t>
+            </w:r>
+            <w:r>
+              <w:rPr>
+                <w:rStyle w:val="VerbatimChar"/>
+              </w:rPr>
+              <w:t xml:space="preserve">plantFloor.html</w:t>
+            </w:r>
+            <w:r>
+              <w:t xml:space="preserve"> </w:t>
+            </w:r>
+            <w:r>
+              <w:t xml:space="preserve">mockup (which gained a new</w:t>
+            </w:r>
+            <w:r>
+              <w:t xml:space="preserve"> </w:t>
+            </w:r>
+            <w:r>
+              <w:rPr>
+                <w:rStyle w:val="VerbatimChar"/>
+              </w:rPr>
+              <w:t xml:space="preserve">terminal/machining-out</w:t>
+            </w:r>
+            <w:r>
+              <w:t xml:space="preserve"> </w:t>
+            </w:r>
+            <w:r>
+              <w:t xml:space="preserve">view and a whole-LOT-move Trim OUT). §3 (UJ-03) decision superseded — split is at Machining OUT (the original 2026-04-09 machining-initiated assumption was right). §4 + §13:</w:t>
             </w:r>
             <w:r>
               <w:t xml:space="preserve"> </w:t>
@@ -5857,7 +5887,7 @@
       <w:r>
         <w:drawing>
           <wp:inline>
-            <wp:extent cx="5334000" cy="2640594"/>
+            <wp:extent cx="5334000" cy="3333750"/>
             <wp:effectExtent b="0" l="0" r="0" t="0"/>
             <wp:docPr descr="Trim Station — Check OUT" title="" id="104" name="Picture"/>
             <a:graphic>
@@ -5878,7 +5908,7 @@
                   <pic:spPr bwMode="auto">
                     <a:xfrm>
                       <a:off x="0" y="0"/>
-                      <a:ext cx="5334000" cy="2640594"/>
+                      <a:ext cx="5334000" cy="3333750"/>
                     </a:xfrm>
                     <a:prstGeom prst="rect">
                       <a:avLst/>
@@ -5914,7 +5944,7 @@
           <w:i/>
           <w:iCs/>
         </w:rPr>
-        <w:t xml:space="preserve">Check OUT state: OperationTemplate banner (TrimOut · 5G0-TRIM-4102 v3). Closing ProductionEvent (TrimOut) section captures Operator Initials. Reject Entry · Trim Yield Loss section below records RejectEvents against the LOT with Trim-area Defect Code and Quantity.</w:t>
+        <w:t xml:space="preserve">Check OUT state: OperationTemplate banner (TrimOut · 5G0-TRIM-4102 v3 —</w:t>
       </w:r>
       <w:r>
         <w:rPr>
@@ -5925,48 +5955,17 @@
       </w:r>
       <w:r>
         <w:rPr>
-          <w:b/>
-          <w:bCs/>
           <w:i/>
           <w:iCs/>
         </w:rPr>
-        <w:t xml:space="preserve">(Screenshot predates the 2026-06 Machining-OUT relocation — it still shows the retired</w:t>
-      </w:r>
-      <w:r>
-        <w:rPr>
-          <w:b/>
-          <w:bCs/>
+        <w:t xml:space="preserve">“whole-LOT move, no split at Trim”</w:t>
+      </w:r>
+      <w:r>
+        <w:rPr>
           <w:i/>
           <w:iCs/>
         </w:rPr>
-        <w:t xml:space="preserve"> </w:t>
-      </w:r>
-      <w:r>
-        <w:rPr>
-          <w:b/>
-          <w:bCs/>
-          <w:i/>
-          <w:iCs/>
-        </w:rPr>
-        <w:t xml:space="preserve">“RequiresSubLotSplit · split + route”</w:t>
-      </w:r>
-      <w:r>
-        <w:rPr>
-          <w:b/>
-          <w:bCs/>
-          <w:i/>
-          <w:iCs/>
-        </w:rPr>
-        <w:t xml:space="preserve"> </w:t>
-      </w:r>
-      <w:r>
-        <w:rPr>
-          <w:b/>
-          <w:bCs/>
-          <w:i/>
-          <w:iCs/>
-        </w:rPr>
-        <w:t xml:space="preserve">toggle at Trim; Trim OUT is now a whole-LOT move. Pending re-capture.)</w:t>
+        <w:t xml:space="preserve">). Closing ProductionEvent captures Operator Initials; Reject Entry · Trim Yield Loss records RejectEvents against the LOT with Trim-area Defect Code and Quantity. The Destination — whole-LOT move panel selects one Machining line (Pieces locked at the full count); Submit · TrimOut + Move.</w:t>
       </w:r>
     </w:p>
     <w:p>
@@ -6216,7 +6215,7 @@
       <w:r>
         <w:drawing>
           <wp:inline>
-            <wp:extent cx="5334000" cy="2640538"/>
+            <wp:extent cx="5334000" cy="2667000"/>
             <wp:effectExtent b="0" l="0" r="0" t="0"/>
             <wp:docPr descr="Machining IN — FIFO queue, LOTs awaiting" title="" id="111" name="Picture"/>
             <a:graphic>
@@ -6237,7 +6236,7 @@
                   <pic:spPr bwMode="auto">
                     <a:xfrm>
                       <a:off x="0" y="0"/>
-                      <a:ext cx="5334000" cy="2640538"/>
+                      <a:ext cx="5334000" cy="2667000"/>
                     </a:xfrm>
                     <a:prstGeom prst="rect">
                       <a:avLst/>
@@ -6273,50 +6272,7 @@
           <w:i/>
           <w:iCs/>
         </w:rPr>
-        <w:t xml:space="preserve">Machining IN screen: no scan-to-receive. FIFO Queue panel lists LOTs in arrival order with Position, LotName, Item, piece count, and arrival time. GOOD badge allows pick; HOLD badge blocks it. Pick (skip queue) is available on non-oldest positions. Active Machined LOT section below fills after a pick confirms.</w:t>
-      </w:r>
-      <w:r>
-        <w:rPr>
-          <w:i/>
-          <w:iCs/>
-        </w:rPr>
-        <w:t xml:space="preserve"> </w:t>
-      </w:r>
-      <w:r>
-        <w:rPr>
-          <w:b/>
-          <w:bCs/>
-          <w:i/>
-          <w:iCs/>
-        </w:rPr>
-        <w:t xml:space="preserve">(Screenshot predates the 2026-06 relocation — it labels the queue entries</w:t>
-      </w:r>
-      <w:r>
-        <w:rPr>
-          <w:b/>
-          <w:bCs/>
-          <w:i/>
-          <w:iCs/>
-        </w:rPr>
-        <w:t xml:space="preserve"> </w:t>
-      </w:r>
-      <w:r>
-        <w:rPr>
-          <w:b/>
-          <w:bCs/>
-          <w:i/>
-          <w:iCs/>
-        </w:rPr>
-        <w:t xml:space="preserve">“sub-LOTs”</w:t>
-      </w:r>
-      <w:r>
-        <w:rPr>
-          <w:b/>
-          <w:bCs/>
-          <w:i/>
-          <w:iCs/>
-        </w:rPr>
-        <w:t xml:space="preserve">; they are now whole cast/trim LOTs, since the split moved to Machining OUT. Pending re-capture.)</w:t>
+        <w:t xml:space="preserve">Machining IN screen: no scan-to-receive. FIFO Queue panel lists whole cast/trim LOTs in arrival order with Position, LotName, Item, piece count, and arrival time. GOOD badge allows pick; HOLD badge blocks it. Pick (skip queue) is available on non-oldest positions. Active Machined LOT section below fills after a pick confirms.</w:t>
       </w:r>
     </w:p>
     <w:p>
@@ -6759,9 +6715,9 @@
       <w:r>
         <w:drawing>
           <wp:inline>
-            <wp:extent cx="5334000" cy="1126940"/>
+            <wp:extent cx="5334000" cy="2500312"/>
             <wp:effectExtent b="0" l="0" r="0" t="0"/>
-            <wp:docPr descr="Sub-LOT Distribution — 2 destinations, 48 pcs split 24/24" title="" id="117" name="Picture"/>
+            <wp:docPr descr="Machining OUT · Sub-LOT Split — 6MA sublotting line, 2 destinations" title="" id="117" name="Picture"/>
             <a:graphic>
               <a:graphicData uri="http://schemas.openxmlformats.org/drawingml/2006/picture">
                 <pic:pic>
@@ -6780,7 +6736,7 @@
                   <pic:spPr bwMode="auto">
                     <a:xfrm>
                       <a:off x="0" y="0"/>
-                      <a:ext cx="5334000" cy="1126940"/>
+                      <a:ext cx="5334000" cy="2500312"/>
                     </a:xfrm>
                     <a:prstGeom prst="rect">
                       <a:avLst/>
@@ -6804,7 +6760,7 @@
         <w:pStyle w:val="ImageCaption"/>
       </w:pPr>
       <w:r>
-        <w:t xml:space="preserve">Sub-LOT Distribution — 2 destinations, 48 pcs split 24/24</w:t>
+        <w:t xml:space="preserve">Machining OUT · Sub-LOT Split — 6MA sublotting line, 2 destinations</w:t>
       </w:r>
     </w:p>
     <w:p>
@@ -6816,50 +6772,7 @@
           <w:i/>
           <w:iCs/>
         </w:rPr>
-        <w:t xml:space="preserve">Sub-LOT Distribution panel: Total pieces shown at top right. Each row is a destination sub-LOT — operator enters Pieces and selects a destination from a dropdown showing queue depth. + Add sub-LOT adds another row. Single submit commits the split + route in one transaction.</w:t>
-      </w:r>
-      <w:r>
-        <w:rPr>
-          <w:i/>
-          <w:iCs/>
-        </w:rPr>
-        <w:t xml:space="preserve"> </w:t>
-      </w:r>
-      <w:r>
-        <w:rPr>
-          <w:b/>
-          <w:bCs/>
-          <w:i/>
-          <w:iCs/>
-        </w:rPr>
-        <w:t xml:space="preserve">(Screenshot predates the 2026-06 relocation — its banner reads</w:t>
-      </w:r>
-      <w:r>
-        <w:rPr>
-          <w:b/>
-          <w:bCs/>
-          <w:i/>
-          <w:iCs/>
-        </w:rPr>
-        <w:t xml:space="preserve"> </w:t>
-      </w:r>
-      <w:r>
-        <w:rPr>
-          <w:b/>
-          <w:bCs/>
-          <w:i/>
-          <w:iCs/>
-        </w:rPr>
-        <w:t xml:space="preserve">“TrimOut + Split + Route”</w:t>
-      </w:r>
-      <w:r>
-        <w:rPr>
-          <w:b/>
-          <w:bCs/>
-          <w:i/>
-          <w:iCs/>
-        </w:rPr>
-        <w:t xml:space="preserve">; this UX now lives at Machining OUT. Pending re-capture.)</w:t>
+        <w:t xml:space="preserve">Machining OUT · Sub-LOT Split (sublotting line — 6MA Cam Holder, RequiresSubLotSplit = ON). Closing ProductionEvent + the Sub-LOT Distribution panel: each row is a destination sub-LOT — operator enters Pieces and selects a destination; + Add sub-LOT adds a row. Submit · MachiningOut + Split + Route commits the split + route in one transaction. Non-sublotting lines auto-move whole to the coupled Assembly Cell (no screen).</w:t>
       </w:r>
     </w:p>
     <w:p>

</xml_diff>